<commit_message>
Rendu du bloc 1 : MCD avec cardinalités, MLD en étoile, chaîne ETL à dépendances explicites
Co-Authored-By: Claude Opus 5.5 <noreply@anthropic.com>
Claude-Session: https://claude.ai/code/session_01K4Z8zdgvPrzbs3BgLqcvsx
</commit_message>
<xml_diff>
--- a/docs/rendu_bloc1.docx
+++ b/docs/rendu_bloc1.docx
@@ -3790,7 +3790,7 @@
                 <w:sz w:val="18"/>
                 <w:szCs w:val="18"/>
               </w:rPr>
-              <w:t xml:space="preserve">Chaque jour à 06:23 UTC</w:t>
+              <w:t xml:space="preserve">Dès que la collecte GHCNh a réussi (secours : 09:23 UTC)</w:t>
             </w:r>
           </w:p>
         </w:tc>
@@ -4559,7 +4559,7 @@
                 <w:sz w:val="18"/>
                 <w:szCs w:val="18"/>
               </w:rPr>
-              <w:t xml:space="preserve">10 tables recalculées en entier chaque jour</w:t>
+              <w:t xml:space="preserve">10 tables recalculées en entier chaque jour, après la collecte du matin</w:t>
             </w:r>
           </w:p>
         </w:tc>
@@ -4691,6 +4691,33 @@
       <w:pPr>
         <w:spacing w:after="120"/>
       </w:pPr>
+    </w:p>
+    <w:p>
+      <w:pPr>
+        <w:pStyle w:val="Heading2"/>
+        <w:keepNext/>
+        <w:keepLines/>
+        <w:spacing w:after="120" w:before="240"/>
+      </w:pPr>
+      <w:r>
+        <w:rPr>
+          <w:rFonts w:ascii="Arial" w:cs="Arial" w:eastAsia="Arial" w:hAnsi="Arial"/>
+        </w:rPr>
+        <w:t xml:space="preserve">Modèle conceptuel (MCD)</w:t>
+      </w:r>
+    </w:p>
+    <w:p>
+      <w:pPr>
+        <w:spacing w:after="120" w:line="276"/>
+      </w:pPr>
+      <w:r>
+        <w:rPr>
+          <w:rFonts w:ascii="Arial" w:cs="Arial" w:eastAsia="Arial" w:hAnsi="Arial"/>
+          <w:sz w:val="21"/>
+          <w:szCs w:val="21"/>
+        </w:rPr>
+        <w:t xml:space="preserve">Chaque mesure est repérée par une heure, et par un lieu pour les mesures locales ; chacune provient d'une source. Les cardinalités se lisent dans les deux sens : une heure a 0 ou 1 mesure de Kp (le Kp est publié toutes les 3 h), et une mesure de Kp a une et une seule heure ; un lieu a 0 à n observations météo, et une observation a un et un seul lieu.</w:t>
+      </w:r>
     </w:p>
     <w:p>
       <w:pPr>
@@ -4701,9 +4728,9 @@
       <w:r>
         <w:drawing>
           <wp:inline distT="0" distB="0" distL="0" distR="0">
-            <wp:extent cx="5715000" cy="4686300"/>
+            <wp:extent cx="5715000" cy="4533900"/>
             <wp:effectExtent t="0" r="0" b="0" l="0"/>
-            <wp:docPr id="2" name="etoile.png" descr="etoile.png" title="etoile.png"/>
+            <wp:docPr id="2" name="mcd.png" descr="mcd.png" title="mcd.png"/>
             <wp:cNvGraphicFramePr>
               <a:graphicFrameLocks xmlns:a="http://schemas.openxmlformats.org/drawingml/2006/main" noChangeAspect="1"/>
             </wp:cNvGraphicFramePr>
@@ -4726,6 +4753,84 @@
                   <pic:spPr bwMode="auto">
                     <a:xfrm>
                       <a:off x="0" y="0"/>
+                      <a:ext cx="5715000" cy="4533900"/>
+                    </a:xfrm>
+                    <a:prstGeom prst="rect">
+                      <a:avLst/>
+                    </a:prstGeom>
+                  </pic:spPr>
+                </pic:pic>
+              </a:graphicData>
+            </a:graphic>
+          </wp:inline>
+        </w:drawing>
+      </w:r>
+    </w:p>
+    <w:p>
+      <w:pPr>
+        <w:spacing w:after="240"/>
+        <w:jc w:val="center"/>
+      </w:pPr>
+      <w:r>
+        <w:rPr>
+          <w:rFonts w:ascii="Arial" w:cs="Arial" w:eastAsia="Arial" w:hAnsi="Arial"/>
+          <w:i/>
+          <w:iCs/>
+          <w:color w:val="595959"/>
+          <w:sz w:val="18"/>
+          <w:szCs w:val="18"/>
+        </w:rPr>
+        <w:t xml:space="preserve">Figure 2. Modèle conceptuel des données : 11 entités et leurs cardinalités</w:t>
+      </w:r>
+    </w:p>
+    <w:p>
+      <w:pPr>
+        <w:pStyle w:val="Heading2"/>
+        <w:keepNext/>
+        <w:keepLines/>
+        <w:spacing w:after="120" w:before="240"/>
+      </w:pPr>
+      <w:r>
+        <w:rPr>
+          <w:rFonts w:ascii="Arial" w:cs="Arial" w:eastAsia="Arial" w:hAnsi="Arial"/>
+        </w:rPr>
+        <w:t xml:space="preserve">Modèle logique (MLD) en étoile</w:t>
+      </w:r>
+    </w:p>
+    <w:p>
+      <w:pPr>
+        <w:keepNext/>
+        <w:spacing w:after="60" w:before="120"/>
+        <w:jc w:val="center"/>
+      </w:pPr>
+      <w:r>
+        <w:drawing>
+          <wp:inline distT="0" distB="0" distL="0" distR="0">
+            <wp:extent cx="5715000" cy="4686300"/>
+            <wp:effectExtent t="0" r="0" b="0" l="0"/>
+            <wp:docPr id="3" name="etoile.png" descr="etoile.png" title="etoile.png"/>
+            <wp:cNvGraphicFramePr>
+              <a:graphicFrameLocks xmlns:a="http://schemas.openxmlformats.org/drawingml/2006/main" noChangeAspect="1"/>
+            </wp:cNvGraphicFramePr>
+            <a:graphic xmlns:a="http://schemas.openxmlformats.org/drawingml/2006/main">
+              <a:graphicData uri="http://schemas.openxmlformats.org/drawingml/2006/picture">
+                <pic:pic xmlns:pic="http://schemas.openxmlformats.org/drawingml/2006/picture">
+                  <pic:nvPicPr>
+                    <pic:cNvPr id="0" name="" descr=""/>
+                    <pic:cNvPicPr>
+                      <a:picLocks noChangeAspect="1" noChangeArrowheads="1"/>
+                    </pic:cNvPicPr>
+                  </pic:nvPicPr>
+                  <pic:blipFill>
+                    <a:blip r:embed="rId11" cstate="none"/>
+                    <a:srcRect/>
+                    <a:stretch>
+                      <a:fillRect/>
+                    </a:stretch>
+                  </pic:blipFill>
+                  <pic:spPr bwMode="auto">
+                    <a:xfrm>
+                      <a:off x="0" y="0"/>
                       <a:ext cx="5715000" cy="4686300"/>
                     </a:xfrm>
                     <a:prstGeom prst="rect">
@@ -4753,21 +4858,7 @@
           <w:sz w:val="18"/>
           <w:szCs w:val="18"/>
         </w:rPr>
-        <w:t xml:space="preserve">Figure 2. Modèle en étoile : 3 dimensions partagées, 8 tables de faits, 1 vue d'analyse</w:t>
-      </w:r>
-    </w:p>
-    <w:p>
-      <w:pPr>
-        <w:pStyle w:val="Heading2"/>
-        <w:keepNext/>
-        <w:keepLines/>
-        <w:spacing w:after="120" w:before="240"/>
-      </w:pPr>
-      <w:r>
-        <w:rPr>
-          <w:rFonts w:ascii="Arial" w:cs="Arial" w:eastAsia="Arial" w:hAnsi="Arial"/>
-        </w:rPr>
-        <w:t xml:space="preserve">Modèle logique</w:t>
+        <w:t xml:space="preserve">Figure 3. Modèle en étoile : 3 dimensions partagées, 8 tables de faits, 1 vue d'analyse</w:t>
       </w:r>
     </w:p>
     <w:p>
@@ -4780,7 +4871,43 @@
           <w:sz w:val="21"/>
           <w:szCs w:val="21"/>
         </w:rPr>
-        <w:t xml:space="preserve">Le modèle en étoile sépare les </w:t>
+        <w:t xml:space="preserve">Le MCD se traduit en modèle en étoile : les entités HEURE, LIEU et SOURCE deviennent les </w:t>
+      </w:r>
+      <w:r>
+        <w:rPr>
+          <w:rFonts w:ascii="Arial" w:cs="Arial" w:eastAsia="Arial" w:hAnsi="Arial"/>
+          <w:b/>
+          <w:bCs/>
+          <w:sz w:val="21"/>
+          <w:szCs w:val="21"/>
+        </w:rPr>
+        <w:t xml:space="preserve">dimensions</w:t>
+      </w:r>
+      <w:r>
+        <w:rPr>
+          <w:rFonts w:ascii="Arial" w:cs="Arial" w:eastAsia="Arial" w:hAnsi="Arial"/>
+          <w:sz w:val="21"/>
+          <w:szCs w:val="21"/>
+        </w:rPr>
+        <w:t xml:space="preserve">, les huit autres les </w:t>
+      </w:r>
+      <w:r>
+        <w:rPr>
+          <w:rFonts w:ascii="Arial" w:cs="Arial" w:eastAsia="Arial" w:hAnsi="Arial"/>
+          <w:b/>
+          <w:bCs/>
+          <w:sz w:val="21"/>
+          <w:szCs w:val="21"/>
+        </w:rPr>
+        <w:t xml:space="preserve">faits</w:t>
+      </w:r>
+      <w:r>
+        <w:rPr>
+          <w:rFonts w:ascii="Arial" w:cs="Arial" w:eastAsia="Arial" w:hAnsi="Arial"/>
+          <w:sz w:val="21"/>
+          <w:szCs w:val="21"/>
+        </w:rPr>
+        <w:t xml:space="preserve">. Le modèle en étoile sépare les </w:t>
       </w:r>
       <w:r>
         <w:rPr>
@@ -6623,7 +6750,7 @@
           <w:sz w:val="21"/>
           <w:szCs w:val="21"/>
         </w:rPr>
-        <w:t xml:space="preserve"> (figure 2) : les requêtes du directeur portent toujours sur « un lieu, une période » ; les dimensions partagées rendent ces filtres simples et rapides, et les faits restent au grain de leur source (3 h pour le Kp, 1 h pour le vent solaire, le jour pour GSOD).</w:t>
+        <w:t xml:space="preserve"> (figure 3) : les requêtes du directeur portent toujours sur « un lieu, une période » ; les dimensions partagées rendent ces filtres simples et rapides, et les faits restent au grain de leur source (3 h pour le Kp, 1 h pour le vent solaire, le jour pour GSOD).</w:t>
       </w:r>
     </w:p>
     <w:p>
@@ -8655,7 +8782,41 @@
           <w:sz w:val="21"/>
           <w:szCs w:val="21"/>
         </w:rPr>
-        <w:t xml:space="preserve"> GitHub Actions enchaîne les étapes par planification (collecte GHCNh à 05:37, transformation et chargement à 06:23). C'est suffisant aujourd'hui ; Airflow (ou Azure Data Factory) apportera les dépendances explicites, les reprises automatiques et le suivi visuel quand le modèle et l'API s'ajouteront à la chaîne.</w:t>
+        <w:t xml:space="preserve"> Les workflows GitHub Actions forment une chaîne à dépendances explicites : la collecte GHCNh part à 05:37 UTC, et </w:t>
+      </w:r>
+      <w:r>
+        <w:rPr>
+          <w:rFonts w:ascii="Arial" w:cs="Arial" w:eastAsia="Arial" w:hAnsi="Arial"/>
+          <w:b/>
+          <w:bCs/>
+          <w:sz w:val="21"/>
+          <w:szCs w:val="21"/>
+        </w:rPr>
+        <w:t xml:space="preserve">sa réussite déclenche la transformation</w:t>
+      </w:r>
+      <w:r>
+        <w:rPr>
+          <w:rFonts w:ascii="Arial" w:cs="Arial" w:eastAsia="Arial" w:hAnsi="Arial"/>
+          <w:sz w:val="21"/>
+          <w:szCs w:val="21"/>
+        </w:rPr>
+        <w:t xml:space="preserve">, qui enchaîne le chargement de l'entrepôt (déclenchement </w:t>
+      </w:r>
+      <w:r>
+        <w:rPr>
+          <w:rFonts w:ascii="Consolas" w:cs="Consolas" w:eastAsia="Consolas" w:hAnsi="Consolas"/>
+          <w:sz w:val="19"/>
+          <w:szCs w:val="19"/>
+        </w:rPr>
+        <w:t xml:space="preserve">workflow_run</w:t>
+      </w:r>
+      <w:r>
+        <w:rPr>
+          <w:rFonts w:ascii="Arial" w:cs="Arial" w:eastAsia="Arial" w:hAnsi="Arial"/>
+          <w:sz w:val="21"/>
+          <w:szCs w:val="21"/>
+        </w:rPr>
+        <w:t xml:space="preserve">). Si la collecte échoue, la transformation ne part pas et l'entrepôt garde la version de la veille ; un passage de secours à 09:23 UTC rattrape une collecte qui n'aurait pas tourné. Airflow (ou Azure Data Factory) reste une évolution possible pour les reprises automatiques et le suivi visuel, quand le modèle et l'API s'ajouteront à la chaîne.</w:t>
       </w:r>
     </w:p>
     <w:p>

</xml_diff>

<commit_message>
Rendu du bloc 1 : où s'exécute chaque étape (tout dans le cloud, aucun traitement local)
Co-Authored-By: Claude Opus 5.5 <noreply@anthropic.com>
Claude-Session: https://claude.ai/code/session_01K4Z8zdgvPrzbs3BgLqcvsx
</commit_message>
<xml_diff>
--- a/docs/rendu_bloc1.docx
+++ b/docs/rendu_bloc1.docx
@@ -239,6 +239,619 @@
         </w:rPr>
         <w:t xml:space="preserve">La chaîne de données d'AuroraCast fonctionne de bout en bout, sans intervention et pour 0 € : sept sources sont collectées automatiquement par les quatre techniques demandées (API, scraping, crawling, requêtes SQL), archivées telles quelles, nettoyées chaque jour en dix tables propres, puis chargées dans un entrepôt PostgreSQL en étoile hébergé dans le cloud (Neon).</w:t>
       </w:r>
+    </w:p>
+    <w:p>
+      <w:pPr>
+        <w:spacing w:after="120" w:line="276"/>
+      </w:pPr>
+      <w:r>
+        <w:rPr>
+          <w:rFonts w:ascii="Arial" w:cs="Arial" w:eastAsia="Arial" w:hAnsi="Arial"/>
+          <w:b/>
+          <w:bCs/>
+          <w:sz w:val="21"/>
+          <w:szCs w:val="21"/>
+        </w:rPr>
+        <w:t xml:space="preserve">Tout s'exécute dans le cloud.</w:t>
+      </w:r>
+      <w:r>
+        <w:rPr>
+          <w:rFonts w:ascii="Arial" w:cs="Arial" w:eastAsia="Arial" w:hAnsi="Arial"/>
+          <w:sz w:val="21"/>
+          <w:szCs w:val="21"/>
+        </w:rPr>
+        <w:t xml:space="preserve"> Collecte, normalisation et chargement tournent sur les machines de GitHub Actions, des machines virtuelles hébergées dans Microsoft Azure ; les données sont stockées sur GitHub et dans Neon (PostgreSQL sur AWS). Aucune donnée n'est traitée sur un poste local puis envoyée : le poste ne sert qu'à écrire le code (envoyé sur GitHub) et à consulter les résultats.</w:t>
+      </w:r>
+    </w:p>
+    <w:tbl>
+      <w:tblPr>
+        <w:tblW w:type="dxa" w:w="9638"/>
+        <w:tblBorders>
+          <w:top w:val="single" w:color="auto" w:sz="4"/>
+          <w:left w:val="single" w:color="auto" w:sz="4"/>
+          <w:bottom w:val="single" w:color="auto" w:sz="4"/>
+          <w:right w:val="single" w:color="auto" w:sz="4"/>
+          <w:insideH w:val="single" w:color="auto" w:sz="4"/>
+          <w:insideV w:val="single" w:color="auto" w:sz="4"/>
+        </w:tblBorders>
+      </w:tblPr>
+      <w:tblGrid>
+        <w:gridCol w:w="2506"/>
+        <w:gridCol w:w="3855"/>
+        <w:gridCol w:w="3277"/>
+      </w:tblGrid>
+      <w:tr>
+        <w:trPr>
+          <w:tblHeader/>
+        </w:trPr>
+        <w:tc>
+          <w:tcPr>
+            <w:tcW w:type="dxa" w:w="2506"/>
+            <w:tcBorders>
+              <w:top w:val="single" w:color="BFBFBF" w:sz="4"/>
+              <w:left w:val="single" w:color="BFBFBF" w:sz="4"/>
+              <w:bottom w:val="single" w:color="BFBFBF" w:sz="4"/>
+              <w:right w:val="single" w:color="BFBFBF" w:sz="4"/>
+            </w:tcBorders>
+            <w:shd w:fill="1F3864" w:color="auto" w:val="clear"/>
+            <w:tcMar>
+              <w:top w:type="dxa" w:w="60"/>
+              <w:left w:type="dxa" w:w="90"/>
+              <w:bottom w:type="dxa" w:w="60"/>
+              <w:right w:type="dxa" w:w="90"/>
+            </w:tcMar>
+          </w:tcPr>
+          <w:p>
+            <w:pPr>
+              <w:spacing w:after="20"/>
+            </w:pPr>
+            <w:r>
+              <w:rPr>
+                <w:rFonts w:ascii="Arial" w:cs="Arial" w:eastAsia="Arial" w:hAnsi="Arial"/>
+                <w:b/>
+                <w:bCs/>
+                <w:color w:val="FFFFFF"/>
+                <w:sz w:val="18"/>
+                <w:szCs w:val="18"/>
+              </w:rPr>
+              <w:t xml:space="preserve">Étape</w:t>
+            </w:r>
+          </w:p>
+        </w:tc>
+        <w:tc>
+          <w:tcPr>
+            <w:tcW w:type="dxa" w:w="3855"/>
+            <w:tcBorders>
+              <w:top w:val="single" w:color="BFBFBF" w:sz="4"/>
+              <w:left w:val="single" w:color="BFBFBF" w:sz="4"/>
+              <w:bottom w:val="single" w:color="BFBFBF" w:sz="4"/>
+              <w:right w:val="single" w:color="BFBFBF" w:sz="4"/>
+            </w:tcBorders>
+            <w:shd w:fill="1F3864" w:color="auto" w:val="clear"/>
+            <w:tcMar>
+              <w:top w:type="dxa" w:w="60"/>
+              <w:left w:type="dxa" w:w="90"/>
+              <w:bottom w:type="dxa" w:w="60"/>
+              <w:right w:type="dxa" w:w="90"/>
+            </w:tcMar>
+          </w:tcPr>
+          <w:p>
+            <w:pPr>
+              <w:spacing w:after="20"/>
+            </w:pPr>
+            <w:r>
+              <w:rPr>
+                <w:rFonts w:ascii="Arial" w:cs="Arial" w:eastAsia="Arial" w:hAnsi="Arial"/>
+                <w:b/>
+                <w:bCs/>
+                <w:color w:val="FFFFFF"/>
+                <w:sz w:val="18"/>
+                <w:szCs w:val="18"/>
+              </w:rPr>
+              <w:t xml:space="preserve">Où elle s'exécute</w:t>
+            </w:r>
+          </w:p>
+        </w:tc>
+        <w:tc>
+          <w:tcPr>
+            <w:tcW w:type="dxa" w:w="3277"/>
+            <w:tcBorders>
+              <w:top w:val="single" w:color="BFBFBF" w:sz="4"/>
+              <w:left w:val="single" w:color="BFBFBF" w:sz="4"/>
+              <w:bottom w:val="single" w:color="BFBFBF" w:sz="4"/>
+              <w:right w:val="single" w:color="BFBFBF" w:sz="4"/>
+            </w:tcBorders>
+            <w:shd w:fill="1F3864" w:color="auto" w:val="clear"/>
+            <w:tcMar>
+              <w:top w:type="dxa" w:w="60"/>
+              <w:left w:type="dxa" w:w="90"/>
+              <w:bottom w:type="dxa" w:w="60"/>
+              <w:right w:type="dxa" w:w="90"/>
+            </w:tcMar>
+          </w:tcPr>
+          <w:p>
+            <w:pPr>
+              <w:spacing w:after="20"/>
+            </w:pPr>
+            <w:r>
+              <w:rPr>
+                <w:rFonts w:ascii="Arial" w:cs="Arial" w:eastAsia="Arial" w:hAnsi="Arial"/>
+                <w:b/>
+                <w:bCs/>
+                <w:color w:val="FFFFFF"/>
+                <w:sz w:val="18"/>
+                <w:szCs w:val="18"/>
+              </w:rPr>
+              <w:t xml:space="preserve">Déclenchement</w:t>
+            </w:r>
+          </w:p>
+        </w:tc>
+      </w:tr>
+      <w:tr>
+        <w:tc>
+          <w:tcPr>
+            <w:tcW w:type="dxa" w:w="2506"/>
+            <w:tcBorders>
+              <w:top w:val="single" w:color="BFBFBF" w:sz="4"/>
+              <w:left w:val="single" w:color="BFBFBF" w:sz="4"/>
+              <w:bottom w:val="single" w:color="BFBFBF" w:sz="4"/>
+              <w:right w:val="single" w:color="BFBFBF" w:sz="4"/>
+            </w:tcBorders>
+            <w:tcMar>
+              <w:top w:type="dxa" w:w="60"/>
+              <w:left w:type="dxa" w:w="90"/>
+              <w:bottom w:type="dxa" w:w="60"/>
+              <w:right w:type="dxa" w:w="90"/>
+            </w:tcMar>
+          </w:tcPr>
+          <w:p>
+            <w:pPr>
+              <w:spacing w:after="20"/>
+            </w:pPr>
+            <w:r>
+              <w:rPr>
+                <w:rFonts w:ascii="Arial" w:cs="Arial" w:eastAsia="Arial" w:hAnsi="Arial"/>
+                <w:sz w:val="18"/>
+                <w:szCs w:val="18"/>
+              </w:rPr>
+              <w:t xml:space="preserve">Collecte des 7 sources</w:t>
+            </w:r>
+          </w:p>
+        </w:tc>
+        <w:tc>
+          <w:tcPr>
+            <w:tcW w:type="dxa" w:w="3855"/>
+            <w:tcBorders>
+              <w:top w:val="single" w:color="BFBFBF" w:sz="4"/>
+              <w:left w:val="single" w:color="BFBFBF" w:sz="4"/>
+              <w:bottom w:val="single" w:color="BFBFBF" w:sz="4"/>
+              <w:right w:val="single" w:color="BFBFBF" w:sz="4"/>
+            </w:tcBorders>
+            <w:tcMar>
+              <w:top w:type="dxa" w:w="60"/>
+              <w:left w:type="dxa" w:w="90"/>
+              <w:bottom w:type="dxa" w:w="60"/>
+              <w:right w:type="dxa" w:w="90"/>
+            </w:tcMar>
+          </w:tcPr>
+          <w:p>
+            <w:pPr>
+              <w:spacing w:after="20"/>
+            </w:pPr>
+            <w:r>
+              <w:rPr>
+                <w:rFonts w:ascii="Arial" w:cs="Arial" w:eastAsia="Arial" w:hAnsi="Arial"/>
+                <w:sz w:val="18"/>
+                <w:szCs w:val="18"/>
+              </w:rPr>
+              <w:t xml:space="preserve">GitHub Actions (VM Azure)</w:t>
+            </w:r>
+          </w:p>
+        </w:tc>
+        <w:tc>
+          <w:tcPr>
+            <w:tcW w:type="dxa" w:w="3277"/>
+            <w:tcBorders>
+              <w:top w:val="single" w:color="BFBFBF" w:sz="4"/>
+              <w:left w:val="single" w:color="BFBFBF" w:sz="4"/>
+              <w:bottom w:val="single" w:color="BFBFBF" w:sz="4"/>
+              <w:right w:val="single" w:color="BFBFBF" w:sz="4"/>
+            </w:tcBorders>
+            <w:tcMar>
+              <w:top w:type="dxa" w:w="60"/>
+              <w:left w:type="dxa" w:w="90"/>
+              <w:bottom w:type="dxa" w:w="60"/>
+              <w:right w:type="dxa" w:w="90"/>
+            </w:tcMar>
+          </w:tcPr>
+          <w:p>
+            <w:pPr>
+              <w:spacing w:after="20"/>
+            </w:pPr>
+            <w:r>
+              <w:rPr>
+                <w:rFonts w:ascii="Arial" w:cs="Arial" w:eastAsia="Arial" w:hAnsi="Arial"/>
+                <w:sz w:val="18"/>
+                <w:szCs w:val="18"/>
+              </w:rPr>
+              <w:t xml:space="preserve">Automatique : toutes les 3 h et chaque jour</w:t>
+            </w:r>
+          </w:p>
+        </w:tc>
+      </w:tr>
+      <w:tr>
+        <w:tc>
+          <w:tcPr>
+            <w:tcW w:type="dxa" w:w="2506"/>
+            <w:tcBorders>
+              <w:top w:val="single" w:color="BFBFBF" w:sz="4"/>
+              <w:left w:val="single" w:color="BFBFBF" w:sz="4"/>
+              <w:bottom w:val="single" w:color="BFBFBF" w:sz="4"/>
+              <w:right w:val="single" w:color="BFBFBF" w:sz="4"/>
+            </w:tcBorders>
+            <w:tcMar>
+              <w:top w:type="dxa" w:w="60"/>
+              <w:left w:type="dxa" w:w="90"/>
+              <w:bottom w:type="dxa" w:w="60"/>
+              <w:right w:type="dxa" w:w="90"/>
+            </w:tcMar>
+          </w:tcPr>
+          <w:p>
+            <w:pPr>
+              <w:spacing w:after="20"/>
+            </w:pPr>
+            <w:r>
+              <w:rPr>
+                <w:rFonts w:ascii="Arial" w:cs="Arial" w:eastAsia="Arial" w:hAnsi="Arial"/>
+                <w:sz w:val="18"/>
+                <w:szCs w:val="18"/>
+              </w:rPr>
+              <w:t xml:space="preserve">Normalisation et nettoyage</w:t>
+            </w:r>
+          </w:p>
+        </w:tc>
+        <w:tc>
+          <w:tcPr>
+            <w:tcW w:type="dxa" w:w="3855"/>
+            <w:tcBorders>
+              <w:top w:val="single" w:color="BFBFBF" w:sz="4"/>
+              <w:left w:val="single" w:color="BFBFBF" w:sz="4"/>
+              <w:bottom w:val="single" w:color="BFBFBF" w:sz="4"/>
+              <w:right w:val="single" w:color="BFBFBF" w:sz="4"/>
+            </w:tcBorders>
+            <w:tcMar>
+              <w:top w:type="dxa" w:w="60"/>
+              <w:left w:type="dxa" w:w="90"/>
+              <w:bottom w:type="dxa" w:w="60"/>
+              <w:right w:type="dxa" w:w="90"/>
+            </w:tcMar>
+          </w:tcPr>
+          <w:p>
+            <w:pPr>
+              <w:spacing w:after="20"/>
+            </w:pPr>
+            <w:r>
+              <w:rPr>
+                <w:rFonts w:ascii="Arial" w:cs="Arial" w:eastAsia="Arial" w:hAnsi="Arial"/>
+                <w:sz w:val="18"/>
+                <w:szCs w:val="18"/>
+              </w:rPr>
+              <w:t xml:space="preserve">GitHub Actions (VM Azure)</w:t>
+            </w:r>
+          </w:p>
+        </w:tc>
+        <w:tc>
+          <w:tcPr>
+            <w:tcW w:type="dxa" w:w="3277"/>
+            <w:tcBorders>
+              <w:top w:val="single" w:color="BFBFBF" w:sz="4"/>
+              <w:left w:val="single" w:color="BFBFBF" w:sz="4"/>
+              <w:bottom w:val="single" w:color="BFBFBF" w:sz="4"/>
+              <w:right w:val="single" w:color="BFBFBF" w:sz="4"/>
+            </w:tcBorders>
+            <w:tcMar>
+              <w:top w:type="dxa" w:w="60"/>
+              <w:left w:type="dxa" w:w="90"/>
+              <w:bottom w:type="dxa" w:w="60"/>
+              <w:right w:type="dxa" w:w="90"/>
+            </w:tcMar>
+          </w:tcPr>
+          <w:p>
+            <w:pPr>
+              <w:spacing w:after="20"/>
+            </w:pPr>
+            <w:r>
+              <w:rPr>
+                <w:rFonts w:ascii="Arial" w:cs="Arial" w:eastAsia="Arial" w:hAnsi="Arial"/>
+                <w:sz w:val="18"/>
+                <w:szCs w:val="18"/>
+              </w:rPr>
+              <w:t xml:space="preserve">Automatique : après la collecte du matin</w:t>
+            </w:r>
+          </w:p>
+        </w:tc>
+      </w:tr>
+      <w:tr>
+        <w:tc>
+          <w:tcPr>
+            <w:tcW w:type="dxa" w:w="2506"/>
+            <w:tcBorders>
+              <w:top w:val="single" w:color="BFBFBF" w:sz="4"/>
+              <w:left w:val="single" w:color="BFBFBF" w:sz="4"/>
+              <w:bottom w:val="single" w:color="BFBFBF" w:sz="4"/>
+              <w:right w:val="single" w:color="BFBFBF" w:sz="4"/>
+            </w:tcBorders>
+            <w:tcMar>
+              <w:top w:type="dxa" w:w="60"/>
+              <w:left w:type="dxa" w:w="90"/>
+              <w:bottom w:type="dxa" w:w="60"/>
+              <w:right w:type="dxa" w:w="90"/>
+            </w:tcMar>
+          </w:tcPr>
+          <w:p>
+            <w:pPr>
+              <w:spacing w:after="20"/>
+            </w:pPr>
+            <w:r>
+              <w:rPr>
+                <w:rFonts w:ascii="Arial" w:cs="Arial" w:eastAsia="Arial" w:hAnsi="Arial"/>
+                <w:sz w:val="18"/>
+                <w:szCs w:val="18"/>
+              </w:rPr>
+              <w:t xml:space="preserve">Chargement de l'entrepôt</w:t>
+            </w:r>
+          </w:p>
+        </w:tc>
+        <w:tc>
+          <w:tcPr>
+            <w:tcW w:type="dxa" w:w="3855"/>
+            <w:tcBorders>
+              <w:top w:val="single" w:color="BFBFBF" w:sz="4"/>
+              <w:left w:val="single" w:color="BFBFBF" w:sz="4"/>
+              <w:bottom w:val="single" w:color="BFBFBF" w:sz="4"/>
+              <w:right w:val="single" w:color="BFBFBF" w:sz="4"/>
+            </w:tcBorders>
+            <w:tcMar>
+              <w:top w:type="dxa" w:w="60"/>
+              <w:left w:type="dxa" w:w="90"/>
+              <w:bottom w:type="dxa" w:w="60"/>
+              <w:right w:type="dxa" w:w="90"/>
+            </w:tcMar>
+          </w:tcPr>
+          <w:p>
+            <w:pPr>
+              <w:spacing w:after="20"/>
+            </w:pPr>
+            <w:r>
+              <w:rPr>
+                <w:rFonts w:ascii="Arial" w:cs="Arial" w:eastAsia="Arial" w:hAnsi="Arial"/>
+                <w:sz w:val="18"/>
+                <w:szCs w:val="18"/>
+              </w:rPr>
+              <w:t xml:space="preserve">GitHub Actions → Neon</w:t>
+            </w:r>
+          </w:p>
+        </w:tc>
+        <w:tc>
+          <w:tcPr>
+            <w:tcW w:type="dxa" w:w="3277"/>
+            <w:tcBorders>
+              <w:top w:val="single" w:color="BFBFBF" w:sz="4"/>
+              <w:left w:val="single" w:color="BFBFBF" w:sz="4"/>
+              <w:bottom w:val="single" w:color="BFBFBF" w:sz="4"/>
+              <w:right w:val="single" w:color="BFBFBF" w:sz="4"/>
+            </w:tcBorders>
+            <w:tcMar>
+              <w:top w:type="dxa" w:w="60"/>
+              <w:left w:type="dxa" w:w="90"/>
+              <w:bottom w:type="dxa" w:w="60"/>
+              <w:right w:type="dxa" w:w="90"/>
+            </w:tcMar>
+          </w:tcPr>
+          <w:p>
+            <w:pPr>
+              <w:spacing w:after="20"/>
+            </w:pPr>
+            <w:r>
+              <w:rPr>
+                <w:rFonts w:ascii="Arial" w:cs="Arial" w:eastAsia="Arial" w:hAnsi="Arial"/>
+                <w:sz w:val="18"/>
+                <w:szCs w:val="18"/>
+              </w:rPr>
+              <w:t xml:space="preserve">Automatique : à la fin de la transformation</w:t>
+            </w:r>
+          </w:p>
+        </w:tc>
+      </w:tr>
+      <w:tr>
+        <w:tc>
+          <w:tcPr>
+            <w:tcW w:type="dxa" w:w="2506"/>
+            <w:tcBorders>
+              <w:top w:val="single" w:color="BFBFBF" w:sz="4"/>
+              <w:left w:val="single" w:color="BFBFBF" w:sz="4"/>
+              <w:bottom w:val="single" w:color="BFBFBF" w:sz="4"/>
+              <w:right w:val="single" w:color="BFBFBF" w:sz="4"/>
+            </w:tcBorders>
+            <w:tcMar>
+              <w:top w:type="dxa" w:w="60"/>
+              <w:left w:type="dxa" w:w="90"/>
+              <w:bottom w:type="dxa" w:w="60"/>
+              <w:right w:type="dxa" w:w="90"/>
+            </w:tcMar>
+          </w:tcPr>
+          <w:p>
+            <w:pPr>
+              <w:spacing w:after="20"/>
+            </w:pPr>
+            <w:r>
+              <w:rPr>
+                <w:rFonts w:ascii="Arial" w:cs="Arial" w:eastAsia="Arial" w:hAnsi="Arial"/>
+                <w:sz w:val="18"/>
+                <w:szCs w:val="18"/>
+              </w:rPr>
+              <w:t xml:space="preserve">Stockage</w:t>
+            </w:r>
+          </w:p>
+        </w:tc>
+        <w:tc>
+          <w:tcPr>
+            <w:tcW w:type="dxa" w:w="3855"/>
+            <w:tcBorders>
+              <w:top w:val="single" w:color="BFBFBF" w:sz="4"/>
+              <w:left w:val="single" w:color="BFBFBF" w:sz="4"/>
+              <w:bottom w:val="single" w:color="BFBFBF" w:sz="4"/>
+              <w:right w:val="single" w:color="BFBFBF" w:sz="4"/>
+            </w:tcBorders>
+            <w:tcMar>
+              <w:top w:type="dxa" w:w="60"/>
+              <w:left w:type="dxa" w:w="90"/>
+              <w:bottom w:type="dxa" w:w="60"/>
+              <w:right w:type="dxa" w:w="90"/>
+            </w:tcMar>
+          </w:tcPr>
+          <w:p>
+            <w:pPr>
+              <w:spacing w:after="20"/>
+            </w:pPr>
+            <w:r>
+              <w:rPr>
+                <w:rFonts w:ascii="Arial" w:cs="Arial" w:eastAsia="Arial" w:hAnsi="Arial"/>
+                <w:sz w:val="18"/>
+                <w:szCs w:val="18"/>
+              </w:rPr>
+              <w:t xml:space="preserve">GitHub (brut, propre) et Neon (entrepôt)</w:t>
+            </w:r>
+          </w:p>
+        </w:tc>
+        <w:tc>
+          <w:tcPr>
+            <w:tcW w:type="dxa" w:w="3277"/>
+            <w:tcBorders>
+              <w:top w:val="single" w:color="BFBFBF" w:sz="4"/>
+              <w:left w:val="single" w:color="BFBFBF" w:sz="4"/>
+              <w:bottom w:val="single" w:color="BFBFBF" w:sz="4"/>
+              <w:right w:val="single" w:color="BFBFBF" w:sz="4"/>
+            </w:tcBorders>
+            <w:tcMar>
+              <w:top w:type="dxa" w:w="60"/>
+              <w:left w:type="dxa" w:w="90"/>
+              <w:bottom w:type="dxa" w:w="60"/>
+              <w:right w:type="dxa" w:w="90"/>
+            </w:tcMar>
+          </w:tcPr>
+          <w:p>
+            <w:pPr>
+              <w:spacing w:after="20"/>
+            </w:pPr>
+            <w:r>
+              <w:rPr>
+                <w:rFonts w:ascii="Arial" w:cs="Arial" w:eastAsia="Arial" w:hAnsi="Arial"/>
+                <w:sz w:val="18"/>
+                <w:szCs w:val="18"/>
+              </w:rPr>
+              <w:t xml:space="preserve">—</w:t>
+            </w:r>
+          </w:p>
+        </w:tc>
+      </w:tr>
+      <w:tr>
+        <w:tc>
+          <w:tcPr>
+            <w:tcW w:type="dxa" w:w="2506"/>
+            <w:tcBorders>
+              <w:top w:val="single" w:color="BFBFBF" w:sz="4"/>
+              <w:left w:val="single" w:color="BFBFBF" w:sz="4"/>
+              <w:bottom w:val="single" w:color="BFBFBF" w:sz="4"/>
+              <w:right w:val="single" w:color="BFBFBF" w:sz="4"/>
+            </w:tcBorders>
+            <w:tcMar>
+              <w:top w:type="dxa" w:w="60"/>
+              <w:left w:type="dxa" w:w="90"/>
+              <w:bottom w:type="dxa" w:w="60"/>
+              <w:right w:type="dxa" w:w="90"/>
+            </w:tcMar>
+          </w:tcPr>
+          <w:p>
+            <w:pPr>
+              <w:spacing w:after="20"/>
+            </w:pPr>
+            <w:r>
+              <w:rPr>
+                <w:rFonts w:ascii="Arial" w:cs="Arial" w:eastAsia="Arial" w:hAnsi="Arial"/>
+                <w:sz w:val="18"/>
+                <w:szCs w:val="18"/>
+              </w:rPr>
+              <w:t xml:space="preserve">Poste local</w:t>
+            </w:r>
+          </w:p>
+        </w:tc>
+        <w:tc>
+          <w:tcPr>
+            <w:tcW w:type="dxa" w:w="3855"/>
+            <w:tcBorders>
+              <w:top w:val="single" w:color="BFBFBF" w:sz="4"/>
+              <w:left w:val="single" w:color="BFBFBF" w:sz="4"/>
+              <w:bottom w:val="single" w:color="BFBFBF" w:sz="4"/>
+              <w:right w:val="single" w:color="BFBFBF" w:sz="4"/>
+            </w:tcBorders>
+            <w:tcMar>
+              <w:top w:type="dxa" w:w="60"/>
+              <w:left w:type="dxa" w:w="90"/>
+              <w:bottom w:type="dxa" w:w="60"/>
+              <w:right w:type="dxa" w:w="90"/>
+            </w:tcMar>
+          </w:tcPr>
+          <w:p>
+            <w:pPr>
+              <w:spacing w:after="20"/>
+            </w:pPr>
+            <w:r>
+              <w:rPr>
+                <w:rFonts w:ascii="Arial" w:cs="Arial" w:eastAsia="Arial" w:hAnsi="Arial"/>
+                <w:sz w:val="18"/>
+                <w:szCs w:val="18"/>
+              </w:rPr>
+              <w:t xml:space="preserve">Développement du code, notebooks, copie Docker de la base</w:t>
+            </w:r>
+          </w:p>
+        </w:tc>
+        <w:tc>
+          <w:tcPr>
+            <w:tcW w:type="dxa" w:w="3277"/>
+            <w:tcBorders>
+              <w:top w:val="single" w:color="BFBFBF" w:sz="4"/>
+              <w:left w:val="single" w:color="BFBFBF" w:sz="4"/>
+              <w:bottom w:val="single" w:color="BFBFBF" w:sz="4"/>
+              <w:right w:val="single" w:color="BFBFBF" w:sz="4"/>
+            </w:tcBorders>
+            <w:tcMar>
+              <w:top w:type="dxa" w:w="60"/>
+              <w:left w:type="dxa" w:w="90"/>
+              <w:bottom w:type="dxa" w:w="60"/>
+              <w:right w:type="dxa" w:w="90"/>
+            </w:tcMar>
+          </w:tcPr>
+          <w:p>
+            <w:pPr>
+              <w:spacing w:after="20"/>
+            </w:pPr>
+            <w:r>
+              <w:rPr>
+                <w:rFonts w:ascii="Arial" w:cs="Arial" w:eastAsia="Arial" w:hAnsi="Arial"/>
+                <w:sz w:val="18"/>
+                <w:szCs w:val="18"/>
+              </w:rPr>
+              <w:t xml:space="preserve">Jamais dans la chaîne de production</w:t>
+            </w:r>
+          </w:p>
+        </w:tc>
+      </w:tr>
+    </w:tbl>
+    <w:p>
+      <w:pPr>
+        <w:spacing w:after="120"/>
+      </w:pPr>
     </w:p>
     <w:p>
       <w:pPr>
@@ -8622,6 +9235,19 @@
     </w:p>
     <w:p>
       <w:pPr>
+        <w:spacing w:after="120" w:line="276"/>
+      </w:pPr>
+      <w:r>
+        <w:rPr>
+          <w:rFonts w:ascii="Arial" w:cs="Arial" w:eastAsia="Arial" w:hAnsi="Arial"/>
+          <w:sz w:val="21"/>
+          <w:szCs w:val="21"/>
+        </w:rPr>
+        <w:t xml:space="preserve">Les trois étapes s'exécutent dans le cloud, sur les machines de GitHub Actions (VM Azure) : aucune normalisation n'est faite sur un poste local.</w:t>
+      </w:r>
+    </w:p>
+    <w:p>
+      <w:pPr>
         <w:pStyle w:val="Heading2"/>
         <w:keepNext/>
         <w:keepLines/>
@@ -11071,6 +11697,24 @@
           <w:szCs w:val="21"/>
         </w:rPr>
         <w:t xml:space="preserve">Compte gratuit Azure : azure.microsoft.com/pricing/purchase-options/azure-account</w:t>
+      </w:r>
+    </w:p>
+    <w:p>
+      <w:pPr>
+        <w:pStyle w:val="ListParagraph"/>
+        <w:numPr>
+          <w:ilvl w:val="0"/>
+          <w:numId w:val="2"/>
+        </w:numPr>
+        <w:spacing w:after="60" w:line="264"/>
+      </w:pPr>
+      <w:r>
+        <w:rPr>
+          <w:rFonts w:ascii="Arial" w:cs="Arial" w:eastAsia="Arial" w:hAnsi="Arial"/>
+          <w:sz w:val="21"/>
+          <w:szCs w:val="21"/>
+        </w:rPr>
+        <w:t xml:space="preserve">GitHub, machines hébergées (VM Azure) : docs.github.com/en/actions/using-github-hosted-runners/about-github-hosted-runners</w:t>
       </w:r>
     </w:p>
     <w:p>

</xml_diff>

<commit_message>
Documentation du 30/10 : Excel (onglets Modèles, Application, Chaîne automatisée, vues de l'entrepôt, INC-005 et INC-006), Word du bloc 1 (section 11, chaîne toutes les 3 h) ; CI : refus des marques de conflit Git
Co-Authored-By: Claude Opus 5.5 <noreply@anthropic.com>
Claude-Session: https://claude.ai/code/session_01K4Z8zdgvPrzbs3BgLqcvsx
</commit_message>
<xml_diff>
--- a/docs/rendu_bloc1.docx
+++ b/docs/rendu_bloc1.docx
@@ -237,7 +237,7 @@
           <w:sz w:val="21"/>
           <w:szCs w:val="21"/>
         </w:rPr>
-        <w:t xml:space="preserve">La chaîne de données d'AuroraCast fonctionne de bout en bout, sans intervention et pour 0 € : sept sources sont collectées automatiquement par les quatre techniques demandées (API, scraping, crawling, requêtes SQL), archivées telles quelles, nettoyées chaque jour en dix tables propres, puis chargées dans un entrepôt PostgreSQL en étoile hébergé dans le cloud (Neon).</w:t>
+        <w:t xml:space="preserve">La chaîne de données d'AuroraCast fonctionne de bout en bout, sans intervention et pour 0 € : sept sources sont collectées automatiquement par les quatre techniques demandées (API, scraping, crawling, requêtes SQL), archivées telles quelles, nettoyées toutes les 3 h en dix tables propres, puis chargées dans un entrepôt PostgreSQL en étoile hébergé dans le cloud (Neon). L'entrepôt alimente déjà trois modèles de prévision réentraînés chaque jour et l'application du directeur, publiée sur le web.</w:t>
       </w:r>
     </w:p>
     <w:p>
@@ -566,7 +566,7 @@
                 <w:sz w:val="18"/>
                 <w:szCs w:val="18"/>
               </w:rPr>
-              <w:t xml:space="preserve">Automatique : après la collecte du matin</w:t>
+              <w:t xml:space="preserve">Automatique : après chaque collecte réussie (toutes les 3 h)</w:t>
             </w:r>
           </w:p>
         </w:tc>
@@ -690,6 +690,190 @@
                 <w:sz w:val="18"/>
                 <w:szCs w:val="18"/>
               </w:rPr>
+              <w:t xml:space="preserve">Entraînement des modèles</w:t>
+            </w:r>
+          </w:p>
+        </w:tc>
+        <w:tc>
+          <w:tcPr>
+            <w:tcW w:type="dxa" w:w="3855"/>
+            <w:tcBorders>
+              <w:top w:val="single" w:color="BFBFBF" w:sz="4"/>
+              <w:left w:val="single" w:color="BFBFBF" w:sz="4"/>
+              <w:bottom w:val="single" w:color="BFBFBF" w:sz="4"/>
+              <w:right w:val="single" w:color="BFBFBF" w:sz="4"/>
+            </w:tcBorders>
+            <w:tcMar>
+              <w:top w:type="dxa" w:w="60"/>
+              <w:left w:type="dxa" w:w="90"/>
+              <w:bottom w:type="dxa" w:w="60"/>
+              <w:right w:type="dxa" w:w="90"/>
+            </w:tcMar>
+          </w:tcPr>
+          <w:p>
+            <w:pPr>
+              <w:spacing w:after="20"/>
+            </w:pPr>
+            <w:r>
+              <w:rPr>
+                <w:rFonts w:ascii="Arial" w:cs="Arial" w:eastAsia="Arial" w:hAnsi="Arial"/>
+                <w:sz w:val="18"/>
+                <w:szCs w:val="18"/>
+              </w:rPr>
+              <w:t xml:space="preserve">GitHub Actions, lecture de Neon</w:t>
+            </w:r>
+          </w:p>
+        </w:tc>
+        <w:tc>
+          <w:tcPr>
+            <w:tcW w:type="dxa" w:w="3277"/>
+            <w:tcBorders>
+              <w:top w:val="single" w:color="BFBFBF" w:sz="4"/>
+              <w:left w:val="single" w:color="BFBFBF" w:sz="4"/>
+              <w:bottom w:val="single" w:color="BFBFBF" w:sz="4"/>
+              <w:right w:val="single" w:color="BFBFBF" w:sz="4"/>
+            </w:tcBorders>
+            <w:tcMar>
+              <w:top w:type="dxa" w:w="60"/>
+              <w:left w:type="dxa" w:w="90"/>
+              <w:bottom w:type="dxa" w:w="60"/>
+              <w:right w:type="dxa" w:w="90"/>
+            </w:tcMar>
+          </w:tcPr>
+          <w:p>
+            <w:pPr>
+              <w:spacing w:after="20"/>
+            </w:pPr>
+            <w:r>
+              <w:rPr>
+                <w:rFonts w:ascii="Arial" w:cs="Arial" w:eastAsia="Arial" w:hAnsi="Arial"/>
+                <w:sz w:val="18"/>
+                <w:szCs w:val="18"/>
+              </w:rPr>
+              <w:t xml:space="preserve">Automatique : chaque jour à 10:13 UTC</w:t>
+            </w:r>
+          </w:p>
+        </w:tc>
+      </w:tr>
+      <w:tr>
+        <w:tc>
+          <w:tcPr>
+            <w:tcW w:type="dxa" w:w="2506"/>
+            <w:tcBorders>
+              <w:top w:val="single" w:color="BFBFBF" w:sz="4"/>
+              <w:left w:val="single" w:color="BFBFBF" w:sz="4"/>
+              <w:bottom w:val="single" w:color="BFBFBF" w:sz="4"/>
+              <w:right w:val="single" w:color="BFBFBF" w:sz="4"/>
+            </w:tcBorders>
+            <w:tcMar>
+              <w:top w:type="dxa" w:w="60"/>
+              <w:left w:type="dxa" w:w="90"/>
+              <w:bottom w:type="dxa" w:w="60"/>
+              <w:right w:type="dxa" w:w="90"/>
+            </w:tcMar>
+          </w:tcPr>
+          <w:p>
+            <w:pPr>
+              <w:spacing w:after="20"/>
+            </w:pPr>
+            <w:r>
+              <w:rPr>
+                <w:rFonts w:ascii="Arial" w:cs="Arial" w:eastAsia="Arial" w:hAnsi="Arial"/>
+                <w:sz w:val="18"/>
+                <w:szCs w:val="18"/>
+              </w:rPr>
+              <w:t xml:space="preserve">Prévisions et application</w:t>
+            </w:r>
+          </w:p>
+        </w:tc>
+        <w:tc>
+          <w:tcPr>
+            <w:tcW w:type="dxa" w:w="3855"/>
+            <w:tcBorders>
+              <w:top w:val="single" w:color="BFBFBF" w:sz="4"/>
+              <w:left w:val="single" w:color="BFBFBF" w:sz="4"/>
+              <w:bottom w:val="single" w:color="BFBFBF" w:sz="4"/>
+              <w:right w:val="single" w:color="BFBFBF" w:sz="4"/>
+            </w:tcBorders>
+            <w:tcMar>
+              <w:top w:type="dxa" w:w="60"/>
+              <w:left w:type="dxa" w:w="90"/>
+              <w:bottom w:type="dxa" w:w="60"/>
+              <w:right w:type="dxa" w:w="90"/>
+            </w:tcMar>
+          </w:tcPr>
+          <w:p>
+            <w:pPr>
+              <w:spacing w:after="20"/>
+            </w:pPr>
+            <w:r>
+              <w:rPr>
+                <w:rFonts w:ascii="Arial" w:cs="Arial" w:eastAsia="Arial" w:hAnsi="Arial"/>
+                <w:sz w:val="18"/>
+                <w:szCs w:val="18"/>
+              </w:rPr>
+              <w:t xml:space="preserve">GitHub Actions → GitHub Pages</w:t>
+            </w:r>
+          </w:p>
+        </w:tc>
+        <w:tc>
+          <w:tcPr>
+            <w:tcW w:type="dxa" w:w="3277"/>
+            <w:tcBorders>
+              <w:top w:val="single" w:color="BFBFBF" w:sz="4"/>
+              <w:left w:val="single" w:color="BFBFBF" w:sz="4"/>
+              <w:bottom w:val="single" w:color="BFBFBF" w:sz="4"/>
+              <w:right w:val="single" w:color="BFBFBF" w:sz="4"/>
+            </w:tcBorders>
+            <w:tcMar>
+              <w:top w:type="dxa" w:w="60"/>
+              <w:left w:type="dxa" w:w="90"/>
+              <w:bottom w:type="dxa" w:w="60"/>
+              <w:right w:type="dxa" w:w="90"/>
+            </w:tcMar>
+          </w:tcPr>
+          <w:p>
+            <w:pPr>
+              <w:spacing w:after="20"/>
+            </w:pPr>
+            <w:r>
+              <w:rPr>
+                <w:rFonts w:ascii="Arial" w:cs="Arial" w:eastAsia="Arial" w:hAnsi="Arial"/>
+                <w:sz w:val="18"/>
+                <w:szCs w:val="18"/>
+              </w:rPr>
+              <w:t xml:space="preserve">Automatique : à la fin de chaque chargement</w:t>
+            </w:r>
+          </w:p>
+        </w:tc>
+      </w:tr>
+      <w:tr>
+        <w:tc>
+          <w:tcPr>
+            <w:tcW w:type="dxa" w:w="2506"/>
+            <w:tcBorders>
+              <w:top w:val="single" w:color="BFBFBF" w:sz="4"/>
+              <w:left w:val="single" w:color="BFBFBF" w:sz="4"/>
+              <w:bottom w:val="single" w:color="BFBFBF" w:sz="4"/>
+              <w:right w:val="single" w:color="BFBFBF" w:sz="4"/>
+            </w:tcBorders>
+            <w:tcMar>
+              <w:top w:type="dxa" w:w="60"/>
+              <w:left w:type="dxa" w:w="90"/>
+              <w:bottom w:type="dxa" w:w="60"/>
+              <w:right w:type="dxa" w:w="90"/>
+            </w:tcMar>
+          </w:tcPr>
+          <w:p>
+            <w:pPr>
+              <w:spacing w:after="20"/>
+            </w:pPr>
+            <w:r>
+              <w:rPr>
+                <w:rFonts w:ascii="Arial" w:cs="Arial" w:eastAsia="Arial" w:hAnsi="Arial"/>
+                <w:sz w:val="18"/>
+                <w:szCs w:val="18"/>
+              </w:rPr>
               <w:t xml:space="preserve">Stockage</w:t>
             </w:r>
           </w:p>
@@ -720,7 +904,7 @@
                 <w:sz w:val="18"/>
                 <w:szCs w:val="18"/>
               </w:rPr>
-              <w:t xml:space="preserve">GitHub (brut, propre) et Neon (entrepôt)</w:t>
+              <w:t xml:space="preserve">GitHub (brut, propre, modèles) et Neon (entrepôt)</w:t>
             </w:r>
           </w:p>
         </w:tc>
@@ -1737,7 +1921,7 @@
                 <w:sz w:val="18"/>
                 <w:szCs w:val="18"/>
               </w:rPr>
-              <w:t xml:space="preserve">Extraction → transformation → chargement, atomique et testé (101 tests)</w:t>
+              <w:t xml:space="preserve">Extraction → transformation → chargement, atomique et testé (123 tests)</w:t>
             </w:r>
           </w:p>
         </w:tc>
@@ -4403,7 +4587,7 @@
                 <w:sz w:val="18"/>
                 <w:szCs w:val="18"/>
               </w:rPr>
-              <w:t xml:space="preserve">Dès que la collecte GHCNh a réussi (secours : 09:23 UTC)</w:t>
+              <w:t xml:space="preserve">Dès qu'une collecte a réussi (GHCNh ou NOAA / MET Norway, donc toutes les 3 h ; secours : 09:23 UTC)</w:t>
             </w:r>
           </w:p>
         </w:tc>
@@ -4449,7 +4633,7 @@
                 <w:sz w:val="18"/>
                 <w:szCs w:val="18"/>
               </w:rPr>
-              <w:t xml:space="preserve">, puis chargement de l'entrepôt Neon</w:t>
+              <w:t xml:space="preserve">, chargement de l'entrepôt Neon, puis prévisions et publication de l'application</w:t>
             </w:r>
           </w:p>
         </w:tc>
@@ -4481,7 +4665,7 @@
                 <w:sz w:val="18"/>
                 <w:szCs w:val="18"/>
               </w:rPr>
-              <w:t xml:space="preserve">Backfill historique</w:t>
+              <w:t xml:space="preserve">Entraînement des modèles</w:t>
             </w:r>
           </w:p>
         </w:tc>
@@ -4511,7 +4695,7 @@
                 <w:sz w:val="18"/>
                 <w:szCs w:val="18"/>
               </w:rPr>
-              <w:t xml:space="preserve">À la demande</w:t>
+              <w:t xml:space="preserve">Chaque jour à 10:13 UTC</w:t>
             </w:r>
           </w:p>
         </w:tc>
@@ -4541,7 +4725,31 @@
                 <w:sz w:val="18"/>
                 <w:szCs w:val="18"/>
               </w:rPr>
-              <w:t xml:space="preserve">Historique GFZ, OMNIWeb, GHCNh, GSOD</w:t>
+              <w:t xml:space="preserve">Lit la vue </w:t>
+            </w:r>
+            <w:r>
+              <w:rPr>
+                <w:rFonts w:ascii="Consolas" w:cs="Consolas" w:eastAsia="Consolas" w:hAnsi="Consolas"/>
+                <w:sz w:val="19"/>
+                <w:szCs w:val="19"/>
+              </w:rPr>
+              <w:t xml:space="preserve">v_training_kp</w:t>
+            </w:r>
+            <w:r>
+              <w:rPr>
+                <w:rFonts w:ascii="Arial" w:cs="Arial" w:eastAsia="Arial" w:hAnsi="Arial"/>
+                <w:sz w:val="18"/>
+                <w:szCs w:val="18"/>
+              </w:rPr>
+              <w:t xml:space="preserve"> dans Neon, réentraîne les 3 modèles, contrôle leur note et les publie dans la branche </w:t>
+            </w:r>
+            <w:r>
+              <w:rPr>
+                <w:rFonts w:ascii="Consolas" w:cs="Consolas" w:eastAsia="Consolas" w:hAnsi="Consolas"/>
+                <w:sz w:val="19"/>
+                <w:szCs w:val="19"/>
+              </w:rPr>
+              <w:t xml:space="preserve">models</w:t>
             </w:r>
           </w:p>
         </w:tc>
@@ -4573,6 +4781,98 @@
                 <w:sz w:val="18"/>
                 <w:szCs w:val="18"/>
               </w:rPr>
+              <w:t xml:space="preserve">Backfill historique</w:t>
+            </w:r>
+          </w:p>
+        </w:tc>
+        <w:tc>
+          <w:tcPr>
+            <w:tcW w:type="dxa" w:w="2313"/>
+            <w:tcBorders>
+              <w:top w:val="single" w:color="BFBFBF" w:sz="4"/>
+              <w:left w:val="single" w:color="BFBFBF" w:sz="4"/>
+              <w:bottom w:val="single" w:color="BFBFBF" w:sz="4"/>
+              <w:right w:val="single" w:color="BFBFBF" w:sz="4"/>
+            </w:tcBorders>
+            <w:tcMar>
+              <w:top w:type="dxa" w:w="60"/>
+              <w:left w:type="dxa" w:w="90"/>
+              <w:bottom w:type="dxa" w:w="60"/>
+              <w:right w:type="dxa" w:w="90"/>
+            </w:tcMar>
+          </w:tcPr>
+          <w:p>
+            <w:pPr>
+              <w:spacing w:after="20"/>
+            </w:pPr>
+            <w:r>
+              <w:rPr>
+                <w:rFonts w:ascii="Arial" w:cs="Arial" w:eastAsia="Arial" w:hAnsi="Arial"/>
+                <w:sz w:val="18"/>
+                <w:szCs w:val="18"/>
+              </w:rPr>
+              <w:t xml:space="preserve">À la demande</w:t>
+            </w:r>
+          </w:p>
+        </w:tc>
+        <w:tc>
+          <w:tcPr>
+            <w:tcW w:type="dxa" w:w="4626"/>
+            <w:tcBorders>
+              <w:top w:val="single" w:color="BFBFBF" w:sz="4"/>
+              <w:left w:val="single" w:color="BFBFBF" w:sz="4"/>
+              <w:bottom w:val="single" w:color="BFBFBF" w:sz="4"/>
+              <w:right w:val="single" w:color="BFBFBF" w:sz="4"/>
+            </w:tcBorders>
+            <w:tcMar>
+              <w:top w:type="dxa" w:w="60"/>
+              <w:left w:type="dxa" w:w="90"/>
+              <w:bottom w:type="dxa" w:w="60"/>
+              <w:right w:type="dxa" w:w="90"/>
+            </w:tcMar>
+          </w:tcPr>
+          <w:p>
+            <w:pPr>
+              <w:spacing w:after="20"/>
+            </w:pPr>
+            <w:r>
+              <w:rPr>
+                <w:rFonts w:ascii="Arial" w:cs="Arial" w:eastAsia="Arial" w:hAnsi="Arial"/>
+                <w:sz w:val="18"/>
+                <w:szCs w:val="18"/>
+              </w:rPr>
+              <w:t xml:space="preserve">Historique GFZ, OMNIWeb, GHCNh, GSOD</w:t>
+            </w:r>
+          </w:p>
+        </w:tc>
+      </w:tr>
+      <w:tr>
+        <w:tc>
+          <w:tcPr>
+            <w:tcW w:type="dxa" w:w="2699"/>
+            <w:tcBorders>
+              <w:top w:val="single" w:color="BFBFBF" w:sz="4"/>
+              <w:left w:val="single" w:color="BFBFBF" w:sz="4"/>
+              <w:bottom w:val="single" w:color="BFBFBF" w:sz="4"/>
+              <w:right w:val="single" w:color="BFBFBF" w:sz="4"/>
+            </w:tcBorders>
+            <w:tcMar>
+              <w:top w:type="dxa" w:w="60"/>
+              <w:left w:type="dxa" w:w="90"/>
+              <w:bottom w:type="dxa" w:w="60"/>
+              <w:right w:type="dxa" w:w="90"/>
+            </w:tcMar>
+          </w:tcPr>
+          <w:p>
+            <w:pPr>
+              <w:spacing w:after="20"/>
+            </w:pPr>
+            <w:r>
+              <w:rPr>
+                <w:rFonts w:ascii="Arial" w:cs="Arial" w:eastAsia="Arial" w:hAnsi="Arial"/>
+                <w:sz w:val="18"/>
+                <w:szCs w:val="18"/>
+              </w:rPr>
               <w:t xml:space="preserve">CI</w:t>
             </w:r>
           </w:p>
@@ -4633,7 +4933,7 @@
                 <w:sz w:val="18"/>
                 <w:szCs w:val="18"/>
               </w:rPr>
-              <w:t xml:space="preserve">ruff + 101 tests, dont un chargement dans un vrai PostgreSQL</w:t>
+              <w:t xml:space="preserve">ruff + 123 tests, dont un chargement dans un vrai PostgreSQL</w:t>
             </w:r>
           </w:p>
         </w:tc>
@@ -5172,7 +5472,7 @@
                 <w:sz w:val="18"/>
                 <w:szCs w:val="18"/>
               </w:rPr>
-              <w:t xml:space="preserve">10 tables recalculées en entier chaque jour, après la collecte du matin</w:t>
+              <w:t xml:space="preserve">10 tables recalculées en entier après chaque collecte (toutes les 3 h)</w:t>
             </w:r>
           </w:p>
         </w:tc>
@@ -5294,7 +5594,137 @@
                 <w:sz w:val="18"/>
                 <w:szCs w:val="18"/>
               </w:rPr>
-              <w:t xml:space="preserve">Rechargé chaque jour en une transaction ; 2,2 millions de lignes, 213 Mo</w:t>
+              <w:t xml:space="preserve">Rechargé toutes les 3 h en une transaction ; 2,2 millions de lignes, 213 Mo</w:t>
+            </w:r>
+          </w:p>
+        </w:tc>
+      </w:tr>
+      <w:tr>
+        <w:tc>
+          <w:tcPr>
+            <w:tcW w:type="dxa" w:w="1542"/>
+            <w:tcBorders>
+              <w:top w:val="single" w:color="BFBFBF" w:sz="4"/>
+              <w:left w:val="single" w:color="BFBFBF" w:sz="4"/>
+              <w:bottom w:val="single" w:color="BFBFBF" w:sz="4"/>
+              <w:right w:val="single" w:color="BFBFBF" w:sz="4"/>
+            </w:tcBorders>
+            <w:tcMar>
+              <w:top w:type="dxa" w:w="60"/>
+              <w:left w:type="dxa" w:w="90"/>
+              <w:bottom w:type="dxa" w:w="60"/>
+              <w:right w:type="dxa" w:w="90"/>
+            </w:tcMar>
+          </w:tcPr>
+          <w:p>
+            <w:pPr>
+              <w:spacing w:after="20"/>
+            </w:pPr>
+            <w:r>
+              <w:rPr>
+                <w:rFonts w:ascii="Arial" w:cs="Arial" w:eastAsia="Arial" w:hAnsi="Arial"/>
+                <w:sz w:val="18"/>
+                <w:szCs w:val="18"/>
+              </w:rPr>
+              <w:t xml:space="preserve">Modèles</w:t>
+            </w:r>
+          </w:p>
+        </w:tc>
+        <w:tc>
+          <w:tcPr>
+            <w:tcW w:type="dxa" w:w="2699"/>
+            <w:tcBorders>
+              <w:top w:val="single" w:color="BFBFBF" w:sz="4"/>
+              <w:left w:val="single" w:color="BFBFBF" w:sz="4"/>
+              <w:bottom w:val="single" w:color="BFBFBF" w:sz="4"/>
+              <w:right w:val="single" w:color="BFBFBF" w:sz="4"/>
+            </w:tcBorders>
+            <w:tcMar>
+              <w:top w:type="dxa" w:w="60"/>
+              <w:left w:type="dxa" w:w="90"/>
+              <w:bottom w:type="dxa" w:w="60"/>
+              <w:right w:type="dxa" w:w="90"/>
+            </w:tcMar>
+          </w:tcPr>
+          <w:p>
+            <w:pPr>
+              <w:spacing w:after="20"/>
+            </w:pPr>
+            <w:r>
+              <w:rPr>
+                <w:rFonts w:ascii="Arial" w:cs="Arial" w:eastAsia="Arial" w:hAnsi="Arial"/>
+                <w:sz w:val="18"/>
+                <w:szCs w:val="18"/>
+              </w:rPr>
+              <w:t xml:space="preserve">Branche Git </w:t>
+            </w:r>
+            <w:r>
+              <w:rPr>
+                <w:rFonts w:ascii="Consolas" w:cs="Consolas" w:eastAsia="Consolas" w:hAnsi="Consolas"/>
+                <w:sz w:val="19"/>
+                <w:szCs w:val="19"/>
+              </w:rPr>
+              <w:t xml:space="preserve">models</w:t>
+            </w:r>
+          </w:p>
+        </w:tc>
+        <w:tc>
+          <w:tcPr>
+            <w:tcW w:type="dxa" w:w="2313"/>
+            <w:tcBorders>
+              <w:top w:val="single" w:color="BFBFBF" w:sz="4"/>
+              <w:left w:val="single" w:color="BFBFBF" w:sz="4"/>
+              <w:bottom w:val="single" w:color="BFBFBF" w:sz="4"/>
+              <w:right w:val="single" w:color="BFBFBF" w:sz="4"/>
+            </w:tcBorders>
+            <w:tcMar>
+              <w:top w:type="dxa" w:w="60"/>
+              <w:left w:type="dxa" w:w="90"/>
+              <w:bottom w:type="dxa" w:w="60"/>
+              <w:right w:type="dxa" w:w="90"/>
+            </w:tcMar>
+          </w:tcPr>
+          <w:p>
+            <w:pPr>
+              <w:spacing w:after="20"/>
+            </w:pPr>
+            <w:r>
+              <w:rPr>
+                <w:rFonts w:ascii="Arial" w:cs="Arial" w:eastAsia="Arial" w:hAnsi="Arial"/>
+                <w:sz w:val="18"/>
+                <w:szCs w:val="18"/>
+              </w:rPr>
+              <w:t xml:space="preserve">Fichiers joblib + métriques JSON</w:t>
+            </w:r>
+          </w:p>
+        </w:tc>
+        <w:tc>
+          <w:tcPr>
+            <w:tcW w:type="dxa" w:w="3084"/>
+            <w:tcBorders>
+              <w:top w:val="single" w:color="BFBFBF" w:sz="4"/>
+              <w:left w:val="single" w:color="BFBFBF" w:sz="4"/>
+              <w:bottom w:val="single" w:color="BFBFBF" w:sz="4"/>
+              <w:right w:val="single" w:color="BFBFBF" w:sz="4"/>
+            </w:tcBorders>
+            <w:tcMar>
+              <w:top w:type="dxa" w:w="60"/>
+              <w:left w:type="dxa" w:w="90"/>
+              <w:bottom w:type="dxa" w:w="60"/>
+              <w:right w:type="dxa" w:w="90"/>
+            </w:tcMar>
+          </w:tcPr>
+          <w:p>
+            <w:pPr>
+              <w:spacing w:after="20"/>
+            </w:pPr>
+            <w:r>
+              <w:rPr>
+                <w:rFonts w:ascii="Arial" w:cs="Arial" w:eastAsia="Arial" w:hAnsi="Arial"/>
+                <w:sz w:val="18"/>
+                <w:szCs w:val="18"/>
+              </w:rPr>
+              <w:t xml:space="preserve">Une version par jour, jamais écrasée : historique complet des modèles</w:t>
             </w:r>
           </w:p>
         </w:tc>
@@ -6504,7 +6934,7 @@
           <w:sz w:val="21"/>
           <w:szCs w:val="21"/>
         </w:rPr>
-        <w:t xml:space="preserve">Python : chargement (</w:t>
+        <w:t xml:space="preserve">SQL : vue </w:t>
       </w:r>
       <w:r>
         <w:rPr>
@@ -6512,31 +6942,15 @@
           <w:sz w:val="19"/>
           <w:szCs w:val="19"/>
         </w:rPr>
-        <w:t xml:space="preserve">auroracast.warehouse.load</w:t>
-      </w:r>
-      <w:r>
-        <w:rPr>
-          <w:rFonts w:ascii="Arial" w:cs="Arial" w:eastAsia="Arial" w:hAnsi="Arial"/>
-          <w:sz w:val="21"/>
-          <w:szCs w:val="21"/>
-        </w:rPr>
-        <w:t xml:space="preserve">), accès aux tables propres pour les notebooks (</w:t>
-      </w:r>
-      <w:r>
-        <w:rPr>
-          <w:rFonts w:ascii="Consolas" w:cs="Consolas" w:eastAsia="Consolas" w:hAnsi="Consolas"/>
-          <w:sz w:val="19"/>
-          <w:szCs w:val="19"/>
-        </w:rPr>
-        <w:t xml:space="preserve">auroracast.data.load</w:t>
-      </w:r>
-      <w:r>
-        <w:rPr>
-          <w:rFonts w:ascii="Arial" w:cs="Arial" w:eastAsia="Arial" w:hAnsi="Arial"/>
-          <w:sz w:val="21"/>
-          <w:szCs w:val="21"/>
-        </w:rPr>
-        <w:t xml:space="preserve">).</w:t>
+        <w:t xml:space="preserve">v_formule_valeurs</w:t>
+      </w:r>
+      <w:r>
+        <w:rPr>
+          <w:rFonts w:ascii="Arial" w:cs="Arial" w:eastAsia="Arial" w:hAnsi="Arial"/>
+          <w:sz w:val="21"/>
+          <w:szCs w:val="21"/>
+        </w:rPr>
+        <w:t xml:space="preserve"> (valeurs réelles des variables de la régression : dernière valeur, moyenne, minimum, maximum).</w:t>
       </w:r>
     </w:p>
     <w:p>
@@ -6554,6 +6968,108 @@
           <w:sz w:val="21"/>
           <w:szCs w:val="21"/>
         </w:rPr>
+        <w:t xml:space="preserve">SQL : vue </w:t>
+      </w:r>
+      <w:r>
+        <w:rPr>
+          <w:rFonts w:ascii="Consolas" w:cs="Consolas" w:eastAsia="Consolas" w:hAnsi="Consolas"/>
+          <w:sz w:val="19"/>
+          <w:szCs w:val="19"/>
+        </w:rPr>
+        <w:t xml:space="preserve">v_training_kp</w:t>
+      </w:r>
+      <w:r>
+        <w:rPr>
+          <w:rFonts w:ascii="Arial" w:cs="Arial" w:eastAsia="Arial" w:hAnsi="Arial"/>
+          <w:sz w:val="21"/>
+          <w:szCs w:val="21"/>
+        </w:rPr>
+        <w:t xml:space="preserve">, la </w:t>
+      </w:r>
+      <w:r>
+        <w:rPr>
+          <w:rFonts w:ascii="Arial" w:cs="Arial" w:eastAsia="Arial" w:hAnsi="Arial"/>
+          <w:b/>
+          <w:bCs/>
+          <w:sz w:val="21"/>
+          <w:szCs w:val="21"/>
+        </w:rPr>
+        <w:t xml:space="preserve">table d'entraînement des modèles</w:t>
+      </w:r>
+      <w:r>
+        <w:rPr>
+          <w:rFonts w:ascii="Arial" w:cs="Arial" w:eastAsia="Arial" w:hAnsi="Arial"/>
+          <w:sz w:val="21"/>
+          <w:szCs w:val="21"/>
+        </w:rPr>
+        <w:t xml:space="preserve"> : une ligne par tranche de 3 h depuis 2010 (49 163 lignes), variables calculées avec les seules mesures connues à la fin de la tranche (pas de fuite du futur), cibles « Kp ≥ 4 dans les 6, 24 et 48 h ». Un test automatique le vérifie avec une tempête fictive.</w:t>
+      </w:r>
+    </w:p>
+    <w:p>
+      <w:pPr>
+        <w:pStyle w:val="ListParagraph"/>
+        <w:numPr>
+          <w:ilvl w:val="0"/>
+          <w:numId w:val="2"/>
+        </w:numPr>
+        <w:spacing w:after="60" w:line="264"/>
+      </w:pPr>
+      <w:r>
+        <w:rPr>
+          <w:rFonts w:ascii="Arial" w:cs="Arial" w:eastAsia="Arial" w:hAnsi="Arial"/>
+          <w:sz w:val="21"/>
+          <w:szCs w:val="21"/>
+        </w:rPr>
+        <w:t xml:space="preserve">Python : chargement (</w:t>
+      </w:r>
+      <w:r>
+        <w:rPr>
+          <w:rFonts w:ascii="Consolas" w:cs="Consolas" w:eastAsia="Consolas" w:hAnsi="Consolas"/>
+          <w:sz w:val="19"/>
+          <w:szCs w:val="19"/>
+        </w:rPr>
+        <w:t xml:space="preserve">auroracast.warehouse.load</w:t>
+      </w:r>
+      <w:r>
+        <w:rPr>
+          <w:rFonts w:ascii="Arial" w:cs="Arial" w:eastAsia="Arial" w:hAnsi="Arial"/>
+          <w:sz w:val="21"/>
+          <w:szCs w:val="21"/>
+        </w:rPr>
+        <w:t xml:space="preserve">), accès aux tables propres pour les notebooks (</w:t>
+      </w:r>
+      <w:r>
+        <w:rPr>
+          <w:rFonts w:ascii="Consolas" w:cs="Consolas" w:eastAsia="Consolas" w:hAnsi="Consolas"/>
+          <w:sz w:val="19"/>
+          <w:szCs w:val="19"/>
+        </w:rPr>
+        <w:t xml:space="preserve">auroracast.data.load</w:t>
+      </w:r>
+      <w:r>
+        <w:rPr>
+          <w:rFonts w:ascii="Arial" w:cs="Arial" w:eastAsia="Arial" w:hAnsi="Arial"/>
+          <w:sz w:val="21"/>
+          <w:szCs w:val="21"/>
+        </w:rPr>
+        <w:t xml:space="preserve">).</w:t>
+      </w:r>
+    </w:p>
+    <w:p>
+      <w:pPr>
+        <w:pStyle w:val="ListParagraph"/>
+        <w:numPr>
+          <w:ilvl w:val="0"/>
+          <w:numId w:val="2"/>
+        </w:numPr>
+        <w:spacing w:after="60" w:line="264"/>
+      </w:pPr>
+      <w:r>
+        <w:rPr>
+          <w:rFonts w:ascii="Arial" w:cs="Arial" w:eastAsia="Arial" w:hAnsi="Arial"/>
+          <w:sz w:val="21"/>
+          <w:szCs w:val="21"/>
+        </w:rPr>
         <w:t xml:space="preserve">Cinq notebooks d'exploration dans VS Code, et la console SQL de Neon ou </w:t>
       </w:r>
       <w:r>
@@ -6635,7 +7151,7 @@
           <w:sz w:val="21"/>
           <w:szCs w:val="21"/>
         </w:rPr>
-        <w:t xml:space="preserve">déployée et alimentée chaque jour</w:t>
+        <w:t xml:space="preserve">déployée et alimentée toutes les 3 h</w:t>
       </w:r>
       <w:r>
         <w:rPr>
@@ -8058,7 +8574,7 @@
           <w:sz w:val="21"/>
           <w:szCs w:val="21"/>
         </w:rPr>
-        <w:t xml:space="preserve">) recalcule chaque jour les dix tables propres à partir de toutes les données brutes, avec des règles communes :</w:t>
+        <w:t xml:space="preserve">) recalcule après chaque collecte les dix tables propres à partir de toutes les données brutes, avec des règles communes :</w:t>
       </w:r>
     </w:p>
     <w:p>
@@ -9385,7 +9901,7 @@
           <w:sz w:val="21"/>
           <w:szCs w:val="21"/>
         </w:rPr>
-        <w:t xml:space="preserve"> : 101 tests automatiques à chaque modification, dont un chargement complet dans un vrai PostgreSQL.</w:t>
+        <w:t xml:space="preserve"> : 123 tests automatiques à chaque modification, dont un chargement complet dans un vrai PostgreSQL.</w:t>
       </w:r>
     </w:p>
     <w:p>
@@ -9408,7 +9924,7 @@
           <w:sz w:val="21"/>
           <w:szCs w:val="21"/>
         </w:rPr>
-        <w:t xml:space="preserve"> Les workflows GitHub Actions forment une chaîne à dépendances explicites : la collecte GHCNh part à 05:37 UTC, et </w:t>
+        <w:t xml:space="preserve"> Les workflows GitHub Actions forment une chaîne à dépendances explicites : </w:t>
       </w:r>
       <w:r>
         <w:rPr>
@@ -9418,15 +9934,15 @@
           <w:sz w:val="21"/>
           <w:szCs w:val="21"/>
         </w:rPr>
-        <w:t xml:space="preserve">sa réussite déclenche la transformation</w:t>
-      </w:r>
-      <w:r>
-        <w:rPr>
-          <w:rFonts w:ascii="Arial" w:cs="Arial" w:eastAsia="Arial" w:hAnsi="Arial"/>
-          <w:sz w:val="21"/>
-          <w:szCs w:val="21"/>
-        </w:rPr>
-        <w:t xml:space="preserve">, qui enchaîne le chargement de l'entrepôt (déclenchement </w:t>
+        <w:t xml:space="preserve">la réussite d'une collecte déclenche la transformation</w:t>
+      </w:r>
+      <w:r>
+        <w:rPr>
+          <w:rFonts w:ascii="Arial" w:cs="Arial" w:eastAsia="Arial" w:hAnsi="Arial"/>
+          <w:sz w:val="21"/>
+          <w:szCs w:val="21"/>
+        </w:rPr>
+        <w:t xml:space="preserve"> (collecte GHCNh à 05:37 UTC, collecte NOAA / MET Norway toutes les 3 h ; déclenchement </w:t>
       </w:r>
       <w:r>
         <w:rPr>
@@ -9442,7 +9958,7 @@
           <w:sz w:val="21"/>
           <w:szCs w:val="21"/>
         </w:rPr>
-        <w:t xml:space="preserve">). Si la collecte échoue, la transformation ne part pas et l'entrepôt garde la version de la veille ; un passage de secours à 09:23 UTC rattrape une collecte qui n'aurait pas tourné. Airflow (ou Azure Data Factory) reste une évolution possible pour les reprises automatiques et le suivi visuel, quand le modèle et l'API s'ajouteront à la chaîne.</w:t>
+        <w:t xml:space="preserve">), qui enchaîne le chargement de l'entrepôt, le calcul des prévisions et la publication de l'application. Si une collecte échoue, la transformation ne part pas et l'entrepôt garde la version précédente ; un passage de secours à 09:23 UTC rattrape une collecte qui n'aurait pas tourné. Airflow (ou Azure Data Factory) reste une évolution possible pour les reprises automatiques et le suivi visuel, quand le modèle et l'API s'ajouteront à la chaîne.</w:t>
       </w:r>
     </w:p>
     <w:p>
@@ -10070,6 +10586,206 @@
                 <w:sz w:val="18"/>
                 <w:szCs w:val="18"/>
               </w:rPr>
+              <w:t xml:space="preserve">Application publiée (GitHub Pages)</w:t>
+            </w:r>
+          </w:p>
+        </w:tc>
+        <w:tc>
+          <w:tcPr>
+            <w:tcW w:type="dxa" w:w="2891"/>
+            <w:tcBorders>
+              <w:top w:val="single" w:color="BFBFBF" w:sz="4"/>
+              <w:left w:val="single" w:color="BFBFBF" w:sz="4"/>
+              <w:bottom w:val="single" w:color="BFBFBF" w:sz="4"/>
+              <w:right w:val="single" w:color="BFBFBF" w:sz="4"/>
+            </w:tcBorders>
+            <w:tcMar>
+              <w:top w:type="dxa" w:w="60"/>
+              <w:left w:type="dxa" w:w="90"/>
+              <w:bottom w:type="dxa" w:w="60"/>
+              <w:right w:type="dxa" w:w="90"/>
+            </w:tcMar>
+          </w:tcPr>
+          <w:p>
+            <w:pPr>
+              <w:spacing w:after="20"/>
+            </w:pPr>
+            <w:r>
+              <w:rPr>
+                <w:rFonts w:ascii="Arial" w:cs="Arial" w:eastAsia="Arial" w:hAnsi="Arial"/>
+                <w:sz w:val="18"/>
+                <w:szCs w:val="18"/>
+              </w:rPr>
+              <w:t xml:space="preserve">Faible : prévisions publiques, aucune donnée personnelle</w:t>
+            </w:r>
+          </w:p>
+        </w:tc>
+        <w:tc>
+          <w:tcPr>
+            <w:tcW w:type="dxa" w:w="4434"/>
+            <w:tcBorders>
+              <w:top w:val="single" w:color="BFBFBF" w:sz="4"/>
+              <w:left w:val="single" w:color="BFBFBF" w:sz="4"/>
+              <w:bottom w:val="single" w:color="BFBFBF" w:sz="4"/>
+              <w:right w:val="single" w:color="BFBFBF" w:sz="4"/>
+            </w:tcBorders>
+            <w:tcMar>
+              <w:top w:type="dxa" w:w="60"/>
+              <w:left w:type="dxa" w:w="90"/>
+              <w:bottom w:type="dxa" w:w="60"/>
+              <w:right w:type="dxa" w:w="90"/>
+            </w:tcMar>
+          </w:tcPr>
+          <w:p>
+            <w:pPr>
+              <w:spacing w:after="20"/>
+            </w:pPr>
+            <w:r>
+              <w:rPr>
+                <w:rFonts w:ascii="Arial" w:cs="Arial" w:eastAsia="Arial" w:hAnsi="Arial"/>
+                <w:sz w:val="18"/>
+                <w:szCs w:val="18"/>
+              </w:rPr>
+              <w:t xml:space="preserve">Page statique en HTTPS ; le navigateur ne lit qu'un fichier de prévisions, jamais la base ; aucun secret dans la page</w:t>
+            </w:r>
+          </w:p>
+        </w:tc>
+      </w:tr>
+      <w:tr>
+        <w:tc>
+          <w:tcPr>
+            <w:tcW w:type="dxa" w:w="2313"/>
+            <w:tcBorders>
+              <w:top w:val="single" w:color="BFBFBF" w:sz="4"/>
+              <w:left w:val="single" w:color="BFBFBF" w:sz="4"/>
+              <w:bottom w:val="single" w:color="BFBFBF" w:sz="4"/>
+              <w:right w:val="single" w:color="BFBFBF" w:sz="4"/>
+            </w:tcBorders>
+            <w:tcMar>
+              <w:top w:type="dxa" w:w="60"/>
+              <w:left w:type="dxa" w:w="90"/>
+              <w:bottom w:type="dxa" w:w="60"/>
+              <w:right w:type="dxa" w:w="90"/>
+            </w:tcMar>
+          </w:tcPr>
+          <w:p>
+            <w:pPr>
+              <w:spacing w:after="20"/>
+            </w:pPr>
+            <w:r>
+              <w:rPr>
+                <w:rFonts w:ascii="Arial" w:cs="Arial" w:eastAsia="Arial" w:hAnsi="Arial"/>
+                <w:sz w:val="18"/>
+                <w:szCs w:val="18"/>
+              </w:rPr>
+              <w:t xml:space="preserve">Modèles</w:t>
+            </w:r>
+          </w:p>
+        </w:tc>
+        <w:tc>
+          <w:tcPr>
+            <w:tcW w:type="dxa" w:w="2891"/>
+            <w:tcBorders>
+              <w:top w:val="single" w:color="BFBFBF" w:sz="4"/>
+              <w:left w:val="single" w:color="BFBFBF" w:sz="4"/>
+              <w:bottom w:val="single" w:color="BFBFBF" w:sz="4"/>
+              <w:right w:val="single" w:color="BFBFBF" w:sz="4"/>
+            </w:tcBorders>
+            <w:tcMar>
+              <w:top w:type="dxa" w:w="60"/>
+              <w:left w:type="dxa" w:w="90"/>
+              <w:bottom w:type="dxa" w:w="60"/>
+              <w:right w:type="dxa" w:w="90"/>
+            </w:tcMar>
+          </w:tcPr>
+          <w:p>
+            <w:pPr>
+              <w:spacing w:after="20"/>
+            </w:pPr>
+            <w:r>
+              <w:rPr>
+                <w:rFonts w:ascii="Arial" w:cs="Arial" w:eastAsia="Arial" w:hAnsi="Arial"/>
+                <w:sz w:val="18"/>
+                <w:szCs w:val="18"/>
+              </w:rPr>
+              <w:t xml:space="preserve">Faible</w:t>
+            </w:r>
+          </w:p>
+        </w:tc>
+        <w:tc>
+          <w:tcPr>
+            <w:tcW w:type="dxa" w:w="4434"/>
+            <w:tcBorders>
+              <w:top w:val="single" w:color="BFBFBF" w:sz="4"/>
+              <w:left w:val="single" w:color="BFBFBF" w:sz="4"/>
+              <w:bottom w:val="single" w:color="BFBFBF" w:sz="4"/>
+              <w:right w:val="single" w:color="BFBFBF" w:sz="4"/>
+            </w:tcBorders>
+            <w:tcMar>
+              <w:top w:type="dxa" w:w="60"/>
+              <w:left w:type="dxa" w:w="90"/>
+              <w:bottom w:type="dxa" w:w="60"/>
+              <w:right w:type="dxa" w:w="90"/>
+            </w:tcMar>
+          </w:tcPr>
+          <w:p>
+            <w:pPr>
+              <w:spacing w:after="20"/>
+            </w:pPr>
+            <w:r>
+              <w:rPr>
+                <w:rFonts w:ascii="Arial" w:cs="Arial" w:eastAsia="Arial" w:hAnsi="Arial"/>
+                <w:sz w:val="18"/>
+                <w:szCs w:val="18"/>
+              </w:rPr>
+              <w:t xml:space="preserve">Versionnés dans la branche </w:t>
+            </w:r>
+            <w:r>
+              <w:rPr>
+                <w:rFonts w:ascii="Consolas" w:cs="Consolas" w:eastAsia="Consolas" w:hAnsi="Consolas"/>
+                <w:sz w:val="19"/>
+                <w:szCs w:val="19"/>
+              </w:rPr>
+              <w:t xml:space="preserve">models</w:t>
+            </w:r>
+            <w:r>
+              <w:rPr>
+                <w:rFonts w:ascii="Arial" w:cs="Arial" w:eastAsia="Arial" w:hAnsi="Arial"/>
+                <w:sz w:val="18"/>
+                <w:szCs w:val="18"/>
+              </w:rPr>
+              <w:t xml:space="preserve"> ; publiés seulement si leur note dépasse le seuil de contrôle (ROC AUC ≥ 0,70)</w:t>
+            </w:r>
+          </w:p>
+        </w:tc>
+      </w:tr>
+      <w:tr>
+        <w:tc>
+          <w:tcPr>
+            <w:tcW w:type="dxa" w:w="2313"/>
+            <w:tcBorders>
+              <w:top w:val="single" w:color="BFBFBF" w:sz="4"/>
+              <w:left w:val="single" w:color="BFBFBF" w:sz="4"/>
+              <w:bottom w:val="single" w:color="BFBFBF" w:sz="4"/>
+              <w:right w:val="single" w:color="BFBFBF" w:sz="4"/>
+            </w:tcBorders>
+            <w:tcMar>
+              <w:top w:type="dxa" w:w="60"/>
+              <w:left w:type="dxa" w:w="90"/>
+              <w:bottom w:type="dxa" w:w="60"/>
+              <w:right w:type="dxa" w:w="90"/>
+            </w:tcMar>
+          </w:tcPr>
+          <w:p>
+            <w:pPr>
+              <w:spacing w:after="20"/>
+            </w:pPr>
+            <w:r>
+              <w:rPr>
+                <w:rFonts w:ascii="Arial" w:cs="Arial" w:eastAsia="Arial" w:hAnsi="Arial"/>
+                <w:sz w:val="18"/>
+                <w:szCs w:val="18"/>
+              </w:rPr>
               <w:t xml:space="preserve">Comptes utilisateurs (à venir)</w:t>
             </w:r>
           </w:p>
@@ -10130,7 +10846,7 @@
                 <w:sz w:val="18"/>
                 <w:szCs w:val="18"/>
               </w:rPr>
-              <w:t xml:space="preserve">À traiter avec l'application : rôle PostgreSQL en lecture seule pour l'API, authentification du directeur</w:t>
+              <w:t xml:space="preserve">À traiter avec l'API : rôle PostgreSQL en lecture seule, authentification du directeur</w:t>
             </w:r>
           </w:p>
         </w:tc>
@@ -10216,15 +10932,49 @@
           <w:sz w:val="21"/>
           <w:szCs w:val="21"/>
         </w:rPr>
-        <w:t xml:space="preserve">rechargé en entier chaque jour</w:t>
-      </w:r>
-      <w:r>
-        <w:rPr>
-          <w:rFonts w:ascii="Arial" w:cs="Arial" w:eastAsia="Arial" w:hAnsi="Arial"/>
-          <w:sz w:val="21"/>
-          <w:szCs w:val="21"/>
-        </w:rPr>
-        <w:t xml:space="preserve"> ; Neon conserve en plus ses sauvegardes 30 jours, chiffrées.</w:t>
+        <w:t xml:space="preserve">rechargé en entier toutes les 3 h</w:t>
+      </w:r>
+      <w:r>
+        <w:rPr>
+          <w:rFonts w:ascii="Arial" w:cs="Arial" w:eastAsia="Arial" w:hAnsi="Arial"/>
+          <w:sz w:val="21"/>
+          <w:szCs w:val="21"/>
+        </w:rPr>
+        <w:t xml:space="preserve"> ; Neon conserve en plus ses sauvegardes, chiffrées.</w:t>
+      </w:r>
+    </w:p>
+    <w:p>
+      <w:pPr>
+        <w:pStyle w:val="ListParagraph"/>
+        <w:numPr>
+          <w:ilvl w:val="0"/>
+          <w:numId w:val="2"/>
+        </w:numPr>
+        <w:spacing w:after="60" w:line="264"/>
+      </w:pPr>
+      <w:r>
+        <w:rPr>
+          <w:rFonts w:ascii="Arial" w:cs="Arial" w:eastAsia="Arial" w:hAnsi="Arial"/>
+          <w:sz w:val="21"/>
+          <w:szCs w:val="21"/>
+        </w:rPr>
+        <w:t xml:space="preserve">Chaque version des modèles reste dans l'historique de la branche </w:t>
+      </w:r>
+      <w:r>
+        <w:rPr>
+          <w:rFonts w:ascii="Consolas" w:cs="Consolas" w:eastAsia="Consolas" w:hAnsi="Consolas"/>
+          <w:sz w:val="19"/>
+          <w:szCs w:val="19"/>
+        </w:rPr>
+        <w:t xml:space="preserve">models</w:t>
+      </w:r>
+      <w:r>
+        <w:rPr>
+          <w:rFonts w:ascii="Arial" w:cs="Arial" w:eastAsia="Arial" w:hAnsi="Arial"/>
+          <w:sz w:val="21"/>
+          <w:szCs w:val="21"/>
+        </w:rPr>
+        <w:t xml:space="preserve"> : on peut revenir à n'importe quelle version précédente.</w:t>
       </w:r>
     </w:p>
     <w:p>
@@ -10777,7 +11527,7 @@
                 <w:sz w:val="18"/>
                 <w:szCs w:val="18"/>
               </w:rPr>
-              <w:t xml:space="preserve">Entrant : chargement quotidien et requêtes</w:t>
+              <w:t xml:space="preserve">Entrant : chargement toutes les 3 h et requêtes</w:t>
             </w:r>
           </w:p>
         </w:tc>
@@ -10808,6 +11558,128 @@
                 <w:szCs w:val="18"/>
               </w:rPr>
               <w:t xml:space="preserve">TLS 1.2/1.3 imposé ; AES-256 au repos ; mot de passe fort</w:t>
+            </w:r>
+          </w:p>
+        </w:tc>
+      </w:tr>
+      <w:tr>
+        <w:tc>
+          <w:tcPr>
+            <w:tcW w:type="dxa" w:w="1542"/>
+            <w:tcBorders>
+              <w:top w:val="single" w:color="BFBFBF" w:sz="4"/>
+              <w:left w:val="single" w:color="BFBFBF" w:sz="4"/>
+              <w:bottom w:val="single" w:color="BFBFBF" w:sz="4"/>
+              <w:right w:val="single" w:color="BFBFBF" w:sz="4"/>
+            </w:tcBorders>
+            <w:tcMar>
+              <w:top w:type="dxa" w:w="60"/>
+              <w:left w:type="dxa" w:w="90"/>
+              <w:bottom w:type="dxa" w:w="60"/>
+              <w:right w:type="dxa" w:w="90"/>
+            </w:tcMar>
+          </w:tcPr>
+          <w:p>
+            <w:pPr>
+              <w:spacing w:after="20"/>
+            </w:pPr>
+            <w:r>
+              <w:rPr>
+                <w:rFonts w:ascii="Arial" w:cs="Arial" w:eastAsia="Arial" w:hAnsi="Arial"/>
+                <w:sz w:val="18"/>
+                <w:szCs w:val="18"/>
+              </w:rPr>
+              <w:t xml:space="preserve">Diffusion</w:t>
+            </w:r>
+          </w:p>
+        </w:tc>
+        <w:tc>
+          <w:tcPr>
+            <w:tcW w:type="dxa" w:w="2506"/>
+            <w:tcBorders>
+              <w:top w:val="single" w:color="BFBFBF" w:sz="4"/>
+              <w:left w:val="single" w:color="BFBFBF" w:sz="4"/>
+              <w:bottom w:val="single" w:color="BFBFBF" w:sz="4"/>
+              <w:right w:val="single" w:color="BFBFBF" w:sz="4"/>
+            </w:tcBorders>
+            <w:tcMar>
+              <w:top w:type="dxa" w:w="60"/>
+              <w:left w:type="dxa" w:w="90"/>
+              <w:bottom w:type="dxa" w:w="60"/>
+              <w:right w:type="dxa" w:w="90"/>
+            </w:tcMar>
+          </w:tcPr>
+          <w:p>
+            <w:pPr>
+              <w:spacing w:after="20"/>
+            </w:pPr>
+            <w:r>
+              <w:rPr>
+                <w:rFonts w:ascii="Arial" w:cs="Arial" w:eastAsia="Arial" w:hAnsi="Arial"/>
+                <w:sz w:val="18"/>
+                <w:szCs w:val="18"/>
+              </w:rPr>
+              <w:t xml:space="preserve">GitHub Pages (application du directeur)</w:t>
+            </w:r>
+          </w:p>
+        </w:tc>
+        <w:tc>
+          <w:tcPr>
+            <w:tcW w:type="dxa" w:w="2699"/>
+            <w:tcBorders>
+              <w:top w:val="single" w:color="BFBFBF" w:sz="4"/>
+              <w:left w:val="single" w:color="BFBFBF" w:sz="4"/>
+              <w:bottom w:val="single" w:color="BFBFBF" w:sz="4"/>
+              <w:right w:val="single" w:color="BFBFBF" w:sz="4"/>
+            </w:tcBorders>
+            <w:tcMar>
+              <w:top w:type="dxa" w:w="60"/>
+              <w:left w:type="dxa" w:w="90"/>
+              <w:bottom w:type="dxa" w:w="60"/>
+              <w:right w:type="dxa" w:w="90"/>
+            </w:tcMar>
+          </w:tcPr>
+          <w:p>
+            <w:pPr>
+              <w:spacing w:after="20"/>
+            </w:pPr>
+            <w:r>
+              <w:rPr>
+                <w:rFonts w:ascii="Arial" w:cs="Arial" w:eastAsia="Arial" w:hAnsi="Arial"/>
+                <w:sz w:val="18"/>
+                <w:szCs w:val="18"/>
+              </w:rPr>
+              <w:t xml:space="preserve">Sortant seulement : fichiers statiques publiés par le workflow</w:t>
+            </w:r>
+          </w:p>
+        </w:tc>
+        <w:tc>
+          <w:tcPr>
+            <w:tcW w:type="dxa" w:w="2891"/>
+            <w:tcBorders>
+              <w:top w:val="single" w:color="BFBFBF" w:sz="4"/>
+              <w:left w:val="single" w:color="BFBFBF" w:sz="4"/>
+              <w:bottom w:val="single" w:color="BFBFBF" w:sz="4"/>
+              <w:right w:val="single" w:color="BFBFBF" w:sz="4"/>
+            </w:tcBorders>
+            <w:tcMar>
+              <w:top w:type="dxa" w:w="60"/>
+              <w:left w:type="dxa" w:w="90"/>
+              <w:bottom w:type="dxa" w:w="60"/>
+              <w:right w:type="dxa" w:w="90"/>
+            </w:tcMar>
+          </w:tcPr>
+          <w:p>
+            <w:pPr>
+              <w:spacing w:after="20"/>
+            </w:pPr>
+            <w:r>
+              <w:rPr>
+                <w:rFonts w:ascii="Arial" w:cs="Arial" w:eastAsia="Arial" w:hAnsi="Arial"/>
+                <w:sz w:val="18"/>
+                <w:szCs w:val="18"/>
+              </w:rPr>
+              <w:t xml:space="preserve">HTTPS ; aucun accès du navigateur à la base ni aux secrets</w:t>
             </w:r>
           </w:p>
         </w:tc>
@@ -11538,6 +12410,727 @@
         <w:pStyle w:val="Heading1"/>
         <w:keepNext/>
         <w:keepLines/>
+        <w:pageBreakBefore/>
+        <w:spacing w:after="160" w:before="0"/>
+      </w:pPr>
+      <w:r>
+        <w:rPr>
+          <w:rFonts w:ascii="Arial" w:cs="Arial" w:eastAsia="Arial" w:hAnsi="Arial"/>
+        </w:rPr>
+        <w:t xml:space="preserve">11. Exploitation des données : modèles et application</w:t>
+      </w:r>
+    </w:p>
+    <w:p>
+      <w:pPr>
+        <w:spacing w:after="120" w:line="276"/>
+      </w:pPr>
+      <w:r>
+        <w:rPr>
+          <w:rFonts w:ascii="Arial" w:cs="Arial" w:eastAsia="Arial" w:hAnsi="Arial"/>
+          <w:sz w:val="21"/>
+          <w:szCs w:val="21"/>
+        </w:rPr>
+        <w:t xml:space="preserve">Cette partie dépasse le bloc 1 ; elle montre que l'architecture de données sert bien l'objectif du projet. Elle sera détaillée dans le rendu du bloc 5.</w:t>
+      </w:r>
+    </w:p>
+    <w:tbl>
+      <w:tblPr>
+        <w:tblW w:type="dxa" w:w="9638"/>
+        <w:tblBorders>
+          <w:top w:val="single" w:color="auto" w:sz="4"/>
+          <w:left w:val="single" w:color="auto" w:sz="4"/>
+          <w:bottom w:val="single" w:color="auto" w:sz="4"/>
+          <w:right w:val="single" w:color="auto" w:sz="4"/>
+          <w:insideH w:val="single" w:color="auto" w:sz="4"/>
+          <w:insideV w:val="single" w:color="auto" w:sz="4"/>
+        </w:tblBorders>
+      </w:tblPr>
+      <w:tblGrid>
+        <w:gridCol w:w="1735"/>
+        <w:gridCol w:w="4819"/>
+        <w:gridCol w:w="3084"/>
+      </w:tblGrid>
+      <w:tr>
+        <w:trPr>
+          <w:tblHeader/>
+        </w:trPr>
+        <w:tc>
+          <w:tcPr>
+            <w:tcW w:type="dxa" w:w="1735"/>
+            <w:tcBorders>
+              <w:top w:val="single" w:color="BFBFBF" w:sz="4"/>
+              <w:left w:val="single" w:color="BFBFBF" w:sz="4"/>
+              <w:bottom w:val="single" w:color="BFBFBF" w:sz="4"/>
+              <w:right w:val="single" w:color="BFBFBF" w:sz="4"/>
+            </w:tcBorders>
+            <w:shd w:fill="1F3864" w:color="auto" w:val="clear"/>
+            <w:tcMar>
+              <w:top w:type="dxa" w:w="60"/>
+              <w:left w:type="dxa" w:w="90"/>
+              <w:bottom w:type="dxa" w:w="60"/>
+              <w:right w:type="dxa" w:w="90"/>
+            </w:tcMar>
+          </w:tcPr>
+          <w:p>
+            <w:pPr>
+              <w:spacing w:after="20"/>
+            </w:pPr>
+            <w:r>
+              <w:rPr>
+                <w:rFonts w:ascii="Arial" w:cs="Arial" w:eastAsia="Arial" w:hAnsi="Arial"/>
+                <w:b/>
+                <w:bCs/>
+                <w:color w:val="FFFFFF"/>
+                <w:sz w:val="18"/>
+                <w:szCs w:val="18"/>
+              </w:rPr>
+              <w:t xml:space="preserve">Élément</w:t>
+            </w:r>
+          </w:p>
+        </w:tc>
+        <w:tc>
+          <w:tcPr>
+            <w:tcW w:type="dxa" w:w="4819"/>
+            <w:tcBorders>
+              <w:top w:val="single" w:color="BFBFBF" w:sz="4"/>
+              <w:left w:val="single" w:color="BFBFBF" w:sz="4"/>
+              <w:bottom w:val="single" w:color="BFBFBF" w:sz="4"/>
+              <w:right w:val="single" w:color="BFBFBF" w:sz="4"/>
+            </w:tcBorders>
+            <w:shd w:fill="1F3864" w:color="auto" w:val="clear"/>
+            <w:tcMar>
+              <w:top w:type="dxa" w:w="60"/>
+              <w:left w:type="dxa" w:w="90"/>
+              <w:bottom w:type="dxa" w:w="60"/>
+              <w:right w:type="dxa" w:w="90"/>
+            </w:tcMar>
+          </w:tcPr>
+          <w:p>
+            <w:pPr>
+              <w:spacing w:after="20"/>
+            </w:pPr>
+            <w:r>
+              <w:rPr>
+                <w:rFonts w:ascii="Arial" w:cs="Arial" w:eastAsia="Arial" w:hAnsi="Arial"/>
+                <w:b/>
+                <w:bCs/>
+                <w:color w:val="FFFFFF"/>
+                <w:sz w:val="18"/>
+                <w:szCs w:val="18"/>
+              </w:rPr>
+              <w:t xml:space="preserve">Ce qui est fait</w:t>
+            </w:r>
+          </w:p>
+        </w:tc>
+        <w:tc>
+          <w:tcPr>
+            <w:tcW w:type="dxa" w:w="3084"/>
+            <w:tcBorders>
+              <w:top w:val="single" w:color="BFBFBF" w:sz="4"/>
+              <w:left w:val="single" w:color="BFBFBF" w:sz="4"/>
+              <w:bottom w:val="single" w:color="BFBFBF" w:sz="4"/>
+              <w:right w:val="single" w:color="BFBFBF" w:sz="4"/>
+            </w:tcBorders>
+            <w:shd w:fill="1F3864" w:color="auto" w:val="clear"/>
+            <w:tcMar>
+              <w:top w:type="dxa" w:w="60"/>
+              <w:left w:type="dxa" w:w="90"/>
+              <w:bottom w:type="dxa" w:w="60"/>
+              <w:right w:type="dxa" w:w="90"/>
+            </w:tcMar>
+          </w:tcPr>
+          <w:p>
+            <w:pPr>
+              <w:spacing w:after="20"/>
+            </w:pPr>
+            <w:r>
+              <w:rPr>
+                <w:rFonts w:ascii="Arial" w:cs="Arial" w:eastAsia="Arial" w:hAnsi="Arial"/>
+                <w:b/>
+                <w:bCs/>
+                <w:color w:val="FFFFFF"/>
+                <w:sz w:val="18"/>
+                <w:szCs w:val="18"/>
+              </w:rPr>
+              <w:t xml:space="preserve">Données utilisées</w:t>
+            </w:r>
+          </w:p>
+        </w:tc>
+      </w:tr>
+      <w:tr>
+        <w:tc>
+          <w:tcPr>
+            <w:tcW w:type="dxa" w:w="1735"/>
+            <w:tcBorders>
+              <w:top w:val="single" w:color="BFBFBF" w:sz="4"/>
+              <w:left w:val="single" w:color="BFBFBF" w:sz="4"/>
+              <w:bottom w:val="single" w:color="BFBFBF" w:sz="4"/>
+              <w:right w:val="single" w:color="BFBFBF" w:sz="4"/>
+            </w:tcBorders>
+            <w:tcMar>
+              <w:top w:type="dxa" w:w="60"/>
+              <w:left w:type="dxa" w:w="90"/>
+              <w:bottom w:type="dxa" w:w="60"/>
+              <w:right w:type="dxa" w:w="90"/>
+            </w:tcMar>
+          </w:tcPr>
+          <w:p>
+            <w:pPr>
+              <w:spacing w:after="20"/>
+            </w:pPr>
+            <w:r>
+              <w:rPr>
+                <w:rFonts w:ascii="Arial" w:cs="Arial" w:eastAsia="Arial" w:hAnsi="Arial"/>
+                <w:sz w:val="18"/>
+                <w:szCs w:val="18"/>
+              </w:rPr>
+              <w:t xml:space="preserve">Modèles</w:t>
+            </w:r>
+          </w:p>
+        </w:tc>
+        <w:tc>
+          <w:tcPr>
+            <w:tcW w:type="dxa" w:w="4819"/>
+            <w:tcBorders>
+              <w:top w:val="single" w:color="BFBFBF" w:sz="4"/>
+              <w:left w:val="single" w:color="BFBFBF" w:sz="4"/>
+              <w:bottom w:val="single" w:color="BFBFBF" w:sz="4"/>
+              <w:right w:val="single" w:color="BFBFBF" w:sz="4"/>
+            </w:tcBorders>
+            <w:tcMar>
+              <w:top w:type="dxa" w:w="60"/>
+              <w:left w:type="dxa" w:w="90"/>
+              <w:bottom w:type="dxa" w:w="60"/>
+              <w:right w:type="dxa" w:w="90"/>
+            </w:tcMar>
+          </w:tcPr>
+          <w:p>
+            <w:pPr>
+              <w:spacing w:after="20"/>
+            </w:pPr>
+            <w:r>
+              <w:rPr>
+                <w:rFonts w:ascii="Arial" w:cs="Arial" w:eastAsia="Arial" w:hAnsi="Arial"/>
+                <w:sz w:val="18"/>
+                <w:szCs w:val="18"/>
+              </w:rPr>
+              <w:t xml:space="preserve">3 régressions logistiques : belle aurore (Kp ≥ 4) dans les 6, 24 et 48 h ; apprentissage 2010-2021, validation 2022-2023, test 2024-2026</w:t>
+            </w:r>
+          </w:p>
+        </w:tc>
+        <w:tc>
+          <w:tcPr>
+            <w:tcW w:type="dxa" w:w="3084"/>
+            <w:tcBorders>
+              <w:top w:val="single" w:color="BFBFBF" w:sz="4"/>
+              <w:left w:val="single" w:color="BFBFBF" w:sz="4"/>
+              <w:bottom w:val="single" w:color="BFBFBF" w:sz="4"/>
+              <w:right w:val="single" w:color="BFBFBF" w:sz="4"/>
+            </w:tcBorders>
+            <w:tcMar>
+              <w:top w:type="dxa" w:w="60"/>
+              <w:left w:type="dxa" w:w="90"/>
+              <w:bottom w:type="dxa" w:w="60"/>
+              <w:right w:type="dxa" w:w="90"/>
+            </w:tcMar>
+          </w:tcPr>
+          <w:p>
+            <w:pPr>
+              <w:spacing w:after="20"/>
+            </w:pPr>
+            <w:r>
+              <w:rPr>
+                <w:rFonts w:ascii="Arial" w:cs="Arial" w:eastAsia="Arial" w:hAnsi="Arial"/>
+                <w:sz w:val="18"/>
+                <w:szCs w:val="18"/>
+              </w:rPr>
+              <w:t xml:space="preserve">Vue </w:t>
+            </w:r>
+            <w:r>
+              <w:rPr>
+                <w:rFonts w:ascii="Consolas" w:cs="Consolas" w:eastAsia="Consolas" w:hAnsi="Consolas"/>
+                <w:sz w:val="19"/>
+                <w:szCs w:val="19"/>
+              </w:rPr>
+              <w:t xml:space="preserve">v_training_kp</w:t>
+            </w:r>
+            <w:r>
+              <w:rPr>
+                <w:rFonts w:ascii="Arial" w:cs="Arial" w:eastAsia="Arial" w:hAnsi="Arial"/>
+                <w:sz w:val="18"/>
+                <w:szCs w:val="18"/>
+              </w:rPr>
+              <w:t xml:space="preserve"> (Kp, vent solaire, flux F10.7, saison)</w:t>
+            </w:r>
+          </w:p>
+        </w:tc>
+      </w:tr>
+      <w:tr>
+        <w:tc>
+          <w:tcPr>
+            <w:tcW w:type="dxa" w:w="1735"/>
+            <w:tcBorders>
+              <w:top w:val="single" w:color="BFBFBF" w:sz="4"/>
+              <w:left w:val="single" w:color="BFBFBF" w:sz="4"/>
+              <w:bottom w:val="single" w:color="BFBFBF" w:sz="4"/>
+              <w:right w:val="single" w:color="BFBFBF" w:sz="4"/>
+            </w:tcBorders>
+            <w:tcMar>
+              <w:top w:type="dxa" w:w="60"/>
+              <w:left w:type="dxa" w:w="90"/>
+              <w:bottom w:type="dxa" w:w="60"/>
+              <w:right w:type="dxa" w:w="90"/>
+            </w:tcMar>
+          </w:tcPr>
+          <w:p>
+            <w:pPr>
+              <w:spacing w:after="20"/>
+            </w:pPr>
+            <w:r>
+              <w:rPr>
+                <w:rFonts w:ascii="Arial" w:cs="Arial" w:eastAsia="Arial" w:hAnsi="Arial"/>
+                <w:sz w:val="18"/>
+                <w:szCs w:val="18"/>
+              </w:rPr>
+              <w:t xml:space="preserve">Résultats (test)</w:t>
+            </w:r>
+          </w:p>
+        </w:tc>
+        <w:tc>
+          <w:tcPr>
+            <w:tcW w:type="dxa" w:w="4819"/>
+            <w:tcBorders>
+              <w:top w:val="single" w:color="BFBFBF" w:sz="4"/>
+              <w:left w:val="single" w:color="BFBFBF" w:sz="4"/>
+              <w:bottom w:val="single" w:color="BFBFBF" w:sz="4"/>
+              <w:right w:val="single" w:color="BFBFBF" w:sz="4"/>
+            </w:tcBorders>
+            <w:tcMar>
+              <w:top w:type="dxa" w:w="60"/>
+              <w:left w:type="dxa" w:w="90"/>
+              <w:bottom w:type="dxa" w:w="60"/>
+              <w:right w:type="dxa" w:w="90"/>
+            </w:tcMar>
+          </w:tcPr>
+          <w:p>
+            <w:pPr>
+              <w:spacing w:after="20"/>
+            </w:pPr>
+            <w:r>
+              <w:rPr>
+                <w:rFonts w:ascii="Arial" w:cs="Arial" w:eastAsia="Arial" w:hAnsi="Arial"/>
+                <w:sz w:val="18"/>
+                <w:szCs w:val="18"/>
+              </w:rPr>
+              <w:t xml:space="preserve">ROC AUC 0,91 (6 h), 0,81 (24 h), 0,75 (48 h) ; meilleurs que « demain = aujourd'hui » et que la fréquence du mois</w:t>
+            </w:r>
+          </w:p>
+        </w:tc>
+        <w:tc>
+          <w:tcPr>
+            <w:tcW w:type="dxa" w:w="3084"/>
+            <w:tcBorders>
+              <w:top w:val="single" w:color="BFBFBF" w:sz="4"/>
+              <w:left w:val="single" w:color="BFBFBF" w:sz="4"/>
+              <w:bottom w:val="single" w:color="BFBFBF" w:sz="4"/>
+              <w:right w:val="single" w:color="BFBFBF" w:sz="4"/>
+            </w:tcBorders>
+            <w:tcMar>
+              <w:top w:type="dxa" w:w="60"/>
+              <w:left w:type="dxa" w:w="90"/>
+              <w:bottom w:type="dxa" w:w="60"/>
+              <w:right w:type="dxa" w:w="90"/>
+            </w:tcMar>
+          </w:tcPr>
+          <w:p>
+            <w:pPr>
+              <w:spacing w:after="20"/>
+            </w:pPr>
+            <w:r>
+              <w:rPr>
+                <w:rFonts w:ascii="Arial" w:cs="Arial" w:eastAsia="Arial" w:hAnsi="Arial"/>
+                <w:sz w:val="18"/>
+                <w:szCs w:val="18"/>
+              </w:rPr>
+              <w:t xml:space="preserve">2024 → aujourd'hui, jamais vu à l'apprentissage</w:t>
+            </w:r>
+          </w:p>
+        </w:tc>
+      </w:tr>
+      <w:tr>
+        <w:tc>
+          <w:tcPr>
+            <w:tcW w:type="dxa" w:w="1735"/>
+            <w:tcBorders>
+              <w:top w:val="single" w:color="BFBFBF" w:sz="4"/>
+              <w:left w:val="single" w:color="BFBFBF" w:sz="4"/>
+              <w:bottom w:val="single" w:color="BFBFBF" w:sz="4"/>
+              <w:right w:val="single" w:color="BFBFBF" w:sz="4"/>
+            </w:tcBorders>
+            <w:tcMar>
+              <w:top w:type="dxa" w:w="60"/>
+              <w:left w:type="dxa" w:w="90"/>
+              <w:bottom w:type="dxa" w:w="60"/>
+              <w:right w:type="dxa" w:w="90"/>
+            </w:tcMar>
+          </w:tcPr>
+          <w:p>
+            <w:pPr>
+              <w:spacing w:after="20"/>
+            </w:pPr>
+            <w:r>
+              <w:rPr>
+                <w:rFonts w:ascii="Arial" w:cs="Arial" w:eastAsia="Arial" w:hAnsi="Arial"/>
+                <w:sz w:val="18"/>
+                <w:szCs w:val="18"/>
+              </w:rPr>
+              <w:t xml:space="preserve">Renouvellement</w:t>
+            </w:r>
+          </w:p>
+        </w:tc>
+        <w:tc>
+          <w:tcPr>
+            <w:tcW w:type="dxa" w:w="4819"/>
+            <w:tcBorders>
+              <w:top w:val="single" w:color="BFBFBF" w:sz="4"/>
+              <w:left w:val="single" w:color="BFBFBF" w:sz="4"/>
+              <w:bottom w:val="single" w:color="BFBFBF" w:sz="4"/>
+              <w:right w:val="single" w:color="BFBFBF" w:sz="4"/>
+            </w:tcBorders>
+            <w:tcMar>
+              <w:top w:type="dxa" w:w="60"/>
+              <w:left w:type="dxa" w:w="90"/>
+              <w:bottom w:type="dxa" w:w="60"/>
+              <w:right w:type="dxa" w:w="90"/>
+            </w:tcMar>
+          </w:tcPr>
+          <w:p>
+            <w:pPr>
+              <w:spacing w:after="20"/>
+            </w:pPr>
+            <w:r>
+              <w:rPr>
+                <w:rFonts w:ascii="Arial" w:cs="Arial" w:eastAsia="Arial" w:hAnsi="Arial"/>
+                <w:sz w:val="18"/>
+                <w:szCs w:val="18"/>
+              </w:rPr>
+              <w:t xml:space="preserve">Chaque jour : évaluation, contrôle (ROC AUC ≥ 0,70), réapprentissage sur toutes les données, publication dans </w:t>
+            </w:r>
+            <w:r>
+              <w:rPr>
+                <w:rFonts w:ascii="Consolas" w:cs="Consolas" w:eastAsia="Consolas" w:hAnsi="Consolas"/>
+                <w:sz w:val="19"/>
+                <w:szCs w:val="19"/>
+              </w:rPr>
+              <w:t xml:space="preserve">models</w:t>
+            </w:r>
+          </w:p>
+        </w:tc>
+        <w:tc>
+          <w:tcPr>
+            <w:tcW w:type="dxa" w:w="3084"/>
+            <w:tcBorders>
+              <w:top w:val="single" w:color="BFBFBF" w:sz="4"/>
+              <w:left w:val="single" w:color="BFBFBF" w:sz="4"/>
+              <w:bottom w:val="single" w:color="BFBFBF" w:sz="4"/>
+              <w:right w:val="single" w:color="BFBFBF" w:sz="4"/>
+            </w:tcBorders>
+            <w:tcMar>
+              <w:top w:type="dxa" w:w="60"/>
+              <w:left w:type="dxa" w:w="90"/>
+              <w:bottom w:type="dxa" w:w="60"/>
+              <w:right w:type="dxa" w:w="90"/>
+            </w:tcMar>
+          </w:tcPr>
+          <w:p>
+            <w:pPr>
+              <w:spacing w:after="20"/>
+            </w:pPr>
+            <w:r>
+              <w:rPr>
+                <w:rFonts w:ascii="Arial" w:cs="Arial" w:eastAsia="Arial" w:hAnsi="Arial"/>
+                <w:sz w:val="18"/>
+                <w:szCs w:val="18"/>
+              </w:rPr>
+              <w:t xml:space="preserve">Entrepôt Neon, mis à jour toutes les 3 h</w:t>
+            </w:r>
+          </w:p>
+        </w:tc>
+      </w:tr>
+      <w:tr>
+        <w:tc>
+          <w:tcPr>
+            <w:tcW w:type="dxa" w:w="1735"/>
+            <w:tcBorders>
+              <w:top w:val="single" w:color="BFBFBF" w:sz="4"/>
+              <w:left w:val="single" w:color="BFBFBF" w:sz="4"/>
+              <w:bottom w:val="single" w:color="BFBFBF" w:sz="4"/>
+              <w:right w:val="single" w:color="BFBFBF" w:sz="4"/>
+            </w:tcBorders>
+            <w:tcMar>
+              <w:top w:type="dxa" w:w="60"/>
+              <w:left w:type="dxa" w:w="90"/>
+              <w:bottom w:type="dxa" w:w="60"/>
+              <w:right w:type="dxa" w:w="90"/>
+            </w:tcMar>
+          </w:tcPr>
+          <w:p>
+            <w:pPr>
+              <w:spacing w:after="20"/>
+            </w:pPr>
+            <w:r>
+              <w:rPr>
+                <w:rFonts w:ascii="Arial" w:cs="Arial" w:eastAsia="Arial" w:hAnsi="Arial"/>
+                <w:sz w:val="18"/>
+                <w:szCs w:val="18"/>
+              </w:rPr>
+              <w:t xml:space="preserve">Application</w:t>
+            </w:r>
+          </w:p>
+        </w:tc>
+        <w:tc>
+          <w:tcPr>
+            <w:tcW w:type="dxa" w:w="4819"/>
+            <w:tcBorders>
+              <w:top w:val="single" w:color="BFBFBF" w:sz="4"/>
+              <w:left w:val="single" w:color="BFBFBF" w:sz="4"/>
+              <w:bottom w:val="single" w:color="BFBFBF" w:sz="4"/>
+              <w:right w:val="single" w:color="BFBFBF" w:sz="4"/>
+            </w:tcBorders>
+            <w:tcMar>
+              <w:top w:type="dxa" w:w="60"/>
+              <w:left w:type="dxa" w:w="90"/>
+              <w:bottom w:type="dxa" w:w="60"/>
+              <w:right w:type="dxa" w:w="90"/>
+            </w:tcMar>
+          </w:tcPr>
+          <w:p>
+            <w:pPr>
+              <w:spacing w:after="20"/>
+            </w:pPr>
+            <w:r>
+              <w:rPr>
+                <w:rFonts w:ascii="Arial" w:cs="Arial" w:eastAsia="Arial" w:hAnsi="Arial"/>
+                <w:sz w:val="18"/>
+                <w:szCs w:val="18"/>
+              </w:rPr>
+              <w:t xml:space="preserve">Page web : choix du lieu, 24 ou 48 h heure par heure, code couleur vert / orange / rouge</w:t>
+            </w:r>
+          </w:p>
+        </w:tc>
+        <w:tc>
+          <w:tcPr>
+            <w:tcW w:type="dxa" w:w="3084"/>
+            <w:tcBorders>
+              <w:top w:val="single" w:color="BFBFBF" w:sz="4"/>
+              <w:left w:val="single" w:color="BFBFBF" w:sz="4"/>
+              <w:bottom w:val="single" w:color="BFBFBF" w:sz="4"/>
+              <w:right w:val="single" w:color="BFBFBF" w:sz="4"/>
+            </w:tcBorders>
+            <w:tcMar>
+              <w:top w:type="dxa" w:w="60"/>
+              <w:left w:type="dxa" w:w="90"/>
+              <w:bottom w:type="dxa" w:w="60"/>
+              <w:right w:type="dxa" w:w="90"/>
+            </w:tcMar>
+          </w:tcPr>
+          <w:p>
+            <w:pPr>
+              <w:spacing w:after="20"/>
+            </w:pPr>
+            <w:r>
+              <w:rPr>
+                <w:rFonts w:ascii="Arial" w:cs="Arial" w:eastAsia="Arial" w:hAnsi="Arial"/>
+                <w:sz w:val="18"/>
+                <w:szCs w:val="18"/>
+              </w:rPr>
+              <w:t xml:space="preserve">Modèles + </w:t>
+            </w:r>
+            <w:r>
+              <w:rPr>
+                <w:rFonts w:ascii="Consolas" w:cs="Consolas" w:eastAsia="Consolas" w:hAnsi="Consolas"/>
+                <w:sz w:val="19"/>
+                <w:szCs w:val="19"/>
+              </w:rPr>
+              <w:t xml:space="preserve">fact_astronomy</w:t>
+            </w:r>
+            <w:r>
+              <w:rPr>
+                <w:rFonts w:ascii="Arial" w:cs="Arial" w:eastAsia="Arial" w:hAnsi="Arial"/>
+                <w:sz w:val="18"/>
+                <w:szCs w:val="18"/>
+              </w:rPr>
+              <w:t xml:space="preserve"> (ciel noir) + </w:t>
+            </w:r>
+            <w:r>
+              <w:rPr>
+                <w:rFonts w:ascii="Consolas" w:cs="Consolas" w:eastAsia="Consolas" w:hAnsi="Consolas"/>
+                <w:sz w:val="19"/>
+                <w:szCs w:val="19"/>
+              </w:rPr>
+              <w:t xml:space="preserve">fact_weather_forecast</w:t>
+            </w:r>
+            <w:r>
+              <w:rPr>
+                <w:rFonts w:ascii="Arial" w:cs="Arial" w:eastAsia="Arial" w:hAnsi="Arial"/>
+                <w:sz w:val="18"/>
+                <w:szCs w:val="18"/>
+              </w:rPr>
+              <w:t xml:space="preserve"> (nuages, brouillard)</w:t>
+            </w:r>
+          </w:p>
+        </w:tc>
+      </w:tr>
+      <w:tr>
+        <w:tc>
+          <w:tcPr>
+            <w:tcW w:type="dxa" w:w="1735"/>
+            <w:tcBorders>
+              <w:top w:val="single" w:color="BFBFBF" w:sz="4"/>
+              <w:left w:val="single" w:color="BFBFBF" w:sz="4"/>
+              <w:bottom w:val="single" w:color="BFBFBF" w:sz="4"/>
+              <w:right w:val="single" w:color="BFBFBF" w:sz="4"/>
+            </w:tcBorders>
+            <w:tcMar>
+              <w:top w:type="dxa" w:w="60"/>
+              <w:left w:type="dxa" w:w="90"/>
+              <w:bottom w:type="dxa" w:w="60"/>
+              <w:right w:type="dxa" w:w="90"/>
+            </w:tcMar>
+          </w:tcPr>
+          <w:p>
+            <w:pPr>
+              <w:spacing w:after="20"/>
+            </w:pPr>
+            <w:r>
+              <w:rPr>
+                <w:rFonts w:ascii="Arial" w:cs="Arial" w:eastAsia="Arial" w:hAnsi="Arial"/>
+                <w:sz w:val="18"/>
+                <w:szCs w:val="18"/>
+              </w:rPr>
+              <w:t xml:space="preserve">Suivi</w:t>
+            </w:r>
+          </w:p>
+        </w:tc>
+        <w:tc>
+          <w:tcPr>
+            <w:tcW w:type="dxa" w:w="4819"/>
+            <w:tcBorders>
+              <w:top w:val="single" w:color="BFBFBF" w:sz="4"/>
+              <w:left w:val="single" w:color="BFBFBF" w:sz="4"/>
+              <w:bottom w:val="single" w:color="BFBFBF" w:sz="4"/>
+              <w:right w:val="single" w:color="BFBFBF" w:sz="4"/>
+            </w:tcBorders>
+            <w:tcMar>
+              <w:top w:type="dxa" w:w="60"/>
+              <w:left w:type="dxa" w:w="90"/>
+              <w:bottom w:type="dxa" w:w="60"/>
+              <w:right w:type="dxa" w:w="90"/>
+            </w:tcMar>
+          </w:tcPr>
+          <w:p>
+            <w:pPr>
+              <w:spacing w:after="20"/>
+            </w:pPr>
+            <w:r>
+              <w:rPr>
+                <w:rFonts w:ascii="Arial" w:cs="Arial" w:eastAsia="Arial" w:hAnsi="Arial"/>
+                <w:sz w:val="18"/>
+                <w:szCs w:val="18"/>
+              </w:rPr>
+              <w:t xml:space="preserve">Page « Suivi des modèles » : progression rejouée depuis 2016, versions quotidiennes, prévisions réelles comparées à la réalité</w:t>
+            </w:r>
+          </w:p>
+        </w:tc>
+        <w:tc>
+          <w:tcPr>
+            <w:tcW w:type="dxa" w:w="3084"/>
+            <w:tcBorders>
+              <w:top w:val="single" w:color="BFBFBF" w:sz="4"/>
+              <w:left w:val="single" w:color="BFBFBF" w:sz="4"/>
+              <w:bottom w:val="single" w:color="BFBFBF" w:sz="4"/>
+              <w:right w:val="single" w:color="BFBFBF" w:sz="4"/>
+            </w:tcBorders>
+            <w:tcMar>
+              <w:top w:type="dxa" w:w="60"/>
+              <w:left w:type="dxa" w:w="90"/>
+              <w:bottom w:type="dxa" w:w="60"/>
+              <w:right w:type="dxa" w:w="90"/>
+            </w:tcMar>
+          </w:tcPr>
+          <w:p>
+            <w:pPr>
+              <w:spacing w:after="20"/>
+            </w:pPr>
+            <w:r>
+              <w:rPr>
+                <w:rFonts w:ascii="Arial" w:cs="Arial" w:eastAsia="Arial" w:hAnsi="Arial"/>
+                <w:sz w:val="18"/>
+                <w:szCs w:val="18"/>
+              </w:rPr>
+              <w:t xml:space="preserve">Branche </w:t>
+            </w:r>
+            <w:r>
+              <w:rPr>
+                <w:rFonts w:ascii="Consolas" w:cs="Consolas" w:eastAsia="Consolas" w:hAnsi="Consolas"/>
+                <w:sz w:val="19"/>
+                <w:szCs w:val="19"/>
+              </w:rPr>
+              <w:t xml:space="preserve">models</w:t>
+            </w:r>
+            <w:r>
+              <w:rPr>
+                <w:rFonts w:ascii="Arial" w:cs="Arial" w:eastAsia="Arial" w:hAnsi="Arial"/>
+                <w:sz w:val="18"/>
+                <w:szCs w:val="18"/>
+              </w:rPr>
+              <w:t xml:space="preserve"> + entrepôt</w:t>
+            </w:r>
+          </w:p>
+        </w:tc>
+      </w:tr>
+    </w:tbl>
+    <w:p>
+      <w:pPr>
+        <w:spacing w:after="120"/>
+      </w:pPr>
+    </w:p>
+    <w:p>
+      <w:pPr>
+        <w:spacing w:after="120" w:line="276"/>
+      </w:pPr>
+      <w:r>
+        <w:rPr>
+          <w:rFonts w:ascii="Arial" w:cs="Arial" w:eastAsia="Arial" w:hAnsi="Arial"/>
+          <w:sz w:val="21"/>
+          <w:szCs w:val="21"/>
+        </w:rPr>
+        <w:t xml:space="preserve">Adresse de l'application : </w:t>
+      </w:r>
+      <w:r>
+        <w:rPr>
+          <w:rFonts w:ascii="Arial" w:cs="Arial" w:eastAsia="Arial" w:hAnsi="Arial"/>
+          <w:b/>
+          <w:bCs/>
+          <w:sz w:val="21"/>
+          <w:szCs w:val="21"/>
+        </w:rPr>
+        <w:t xml:space="preserve">esenel19.github.io/auroracast</w:t>
+      </w:r>
+      <w:r>
+        <w:rPr>
+          <w:rFonts w:ascii="Arial" w:cs="Arial" w:eastAsia="Arial" w:hAnsi="Arial"/>
+          <w:sz w:val="21"/>
+          <w:szCs w:val="21"/>
+        </w:rPr>
+        <w:t xml:space="preserve"> (mise à jour toutes les 3 h).</w:t>
+      </w:r>
+    </w:p>
+    <w:p>
+      <w:pPr>
+        <w:pStyle w:val="Heading1"/>
+        <w:keepNext/>
+        <w:keepLines/>
         <w:spacing w:after="160" w:before="360"/>
       </w:pPr>
       <w:r>
@@ -11642,7 +13235,39 @@
           <w:sz w:val="21"/>
           <w:szCs w:val="21"/>
         </w:rPr>
-        <w:t xml:space="preserve">, notebooks 01 à 05.</w:t>
+        <w:t xml:space="preserve">, notebooks 01 à 05, </w:t>
+      </w:r>
+      <w:r>
+        <w:rPr>
+          <w:rFonts w:ascii="Consolas" w:cs="Consolas" w:eastAsia="Consolas" w:hAnsi="Consolas"/>
+          <w:sz w:val="19"/>
+          <w:szCs w:val="19"/>
+        </w:rPr>
+        <w:t xml:space="preserve">src/auroracast/model/</w:t>
+      </w:r>
+      <w:r>
+        <w:rPr>
+          <w:rFonts w:ascii="Arial" w:cs="Arial" w:eastAsia="Arial" w:hAnsi="Arial"/>
+          <w:sz w:val="21"/>
+          <w:szCs w:val="21"/>
+        </w:rPr>
+        <w:t xml:space="preserve"> (modèles), </w:t>
+      </w:r>
+      <w:r>
+        <w:rPr>
+          <w:rFonts w:ascii="Consolas" w:cs="Consolas" w:eastAsia="Consolas" w:hAnsi="Consolas"/>
+          <w:sz w:val="19"/>
+          <w:szCs w:val="19"/>
+        </w:rPr>
+        <w:t xml:space="preserve">web/</w:t>
+      </w:r>
+      <w:r>
+        <w:rPr>
+          <w:rFonts w:ascii="Arial" w:cs="Arial" w:eastAsia="Arial" w:hAnsi="Arial"/>
+          <w:sz w:val="21"/>
+          <w:szCs w:val="21"/>
+        </w:rPr>
+        <w:t xml:space="preserve"> (application).</w:t>
       </w:r>
     </w:p>
     <w:p>

</xml_diff>